<commit_message>
feat: update program file with new detailed version 2025
</commit_message>
<xml_diff>
--- a/public/program.docx
+++ b/public/program.docx
@@ -10,6 +10,7 @@
           <w:b/>
           <w:sz w:val="32"/>
           <w:szCs w:val="32"/>
+          <w:lang w:val="ru-RU"/>
         </w:rPr>
       </w:pPr>
       <w:proofErr w:type="spellStart"/>
@@ -46,7 +47,33 @@
           <w:sz w:val="32"/>
           <w:szCs w:val="32"/>
         </w:rPr>
-        <w:t xml:space="preserve"> программа</w:t>
+        <w:t xml:space="preserve"> </w:t>
+      </w:r>
+      <w:r>
+        <w:rPr>
+          <w:b/>
+          <w:sz w:val="32"/>
+          <w:szCs w:val="32"/>
+          <w:lang w:val="ru-RU"/>
+        </w:rPr>
+        <w:t xml:space="preserve">2025 </w:t>
+      </w:r>
+      <w:r>
+        <w:rPr>
+          <w:b/>
+          <w:sz w:val="32"/>
+          <w:szCs w:val="32"/>
+        </w:rPr>
+        <w:t>программа</w:t>
+      </w:r>
+      <w:r>
+        <w:rPr>
+          <w:b/>
+          <w:sz w:val="32"/>
+          <w:szCs w:val="32"/>
+          <w:lang w:val="ru-RU"/>
+        </w:rPr>
+        <w:t xml:space="preserve"> фестиваля</w:t>
       </w:r>
     </w:p>
     <w:p>
@@ -294,13 +321,7 @@
               <w:rPr>
                 <w:lang w:val="ru-RU"/>
               </w:rPr>
-              <w:t xml:space="preserve"> общество</w:t>
-            </w:r>
-            <w:r>
-              <w:rPr>
-                <w:lang w:val="ru-RU"/>
-              </w:rPr>
-              <w:t xml:space="preserve"> </w:t>
+              <w:t xml:space="preserve"> общество </w:t>
             </w:r>
           </w:p>
         </w:tc>
@@ -483,13 +504,7 @@
               <w:rPr>
                 <w:lang w:val="ru-RU"/>
               </w:rPr>
-              <w:t xml:space="preserve">: </w:t>
-            </w:r>
-            <w:r>
-              <w:rPr>
-                <w:lang w:val="ru-RU"/>
-              </w:rPr>
-              <w:t>Эко-Город</w:t>
+              <w:t>: Эко-Город</w:t>
             </w:r>
           </w:p>
         </w:tc>
@@ -563,21 +578,7 @@
                 <w:b/>
                 <w:lang w:val="ru-RU"/>
               </w:rPr>
-              <w:t>Институт</w:t>
-            </w:r>
-            <w:r>
-              <w:rPr>
-                <w:b/>
-                <w:lang w:val="ru-RU"/>
-              </w:rPr>
-              <w:t>а</w:t>
-            </w:r>
-            <w:r>
-              <w:rPr>
-                <w:b/>
-                <w:lang w:val="ru-RU"/>
-              </w:rPr>
-              <w:t xml:space="preserve"> Ботаники и Фитоинтродукции, </w:t>
+              <w:t xml:space="preserve">Института Ботаники и Фитоинтродукции, </w:t>
             </w:r>
             <w:proofErr w:type="spellStart"/>
             <w:r>
@@ -835,6 +836,13 @@
               </w:rPr>
               <w:t>Book</w:t>
             </w:r>
+            <w:r>
+              <w:rPr>
+                <w:b/>
+                <w:lang w:val="ru-RU"/>
+              </w:rPr>
+              <w:t xml:space="preserve"> </w:t>
+            </w:r>
             <w:proofErr w:type="gramStart"/>
             <w:r>
               <w:rPr>
@@ -870,19 +878,25 @@
                 <w:b/>
                 <w:lang w:val="ru-RU"/>
               </w:rPr>
-              <w:t>ОФ КОМУНИТИ+</w:t>
-            </w:r>
-            <w:r>
-              <w:rPr>
-                <w:lang w:val="ru-RU"/>
-              </w:rPr>
-              <w:t xml:space="preserve"> </w:t>
+              <w:t>ОФ КОМУНИТИПЛЮС</w:t>
             </w:r>
             <w:r>
               <w:rPr>
                 <w:lang w:val="kk-KZ"/>
               </w:rPr>
-              <w:t xml:space="preserve">, риснки природы от  </w:t>
+              <w:t>, рис</w:t>
+            </w:r>
+            <w:r>
+              <w:rPr>
+                <w:lang w:val="kk-KZ"/>
+              </w:rPr>
+              <w:t>у</w:t>
+            </w:r>
+            <w:r>
+              <w:rPr>
+                <w:lang w:val="kk-KZ"/>
+              </w:rPr>
+              <w:t xml:space="preserve">нки природы от  </w:t>
             </w:r>
             <w:r>
               <w:rPr>
@@ -952,10 +966,7 @@
               <w:spacing w:line="240" w:lineRule="auto"/>
             </w:pPr>
             <w:r>
-              <w:t>- мастер-класс по изготовлению домиков и поилок для насекомых</w:t>
-            </w:r>
-            <w:r>
-              <w:t xml:space="preserve"> </w:t>
+              <w:t xml:space="preserve">- мастер-класс по изготовлению домиков и поилок для насекомых </w:t>
             </w:r>
             <w:r>
               <w:rPr>
@@ -1125,7 +1136,21 @@
               <w:rPr>
                 <w:lang w:val="ru-RU"/>
               </w:rPr>
-              <w:t>от флориста Яны</w:t>
+              <w:t xml:space="preserve">от </w:t>
+            </w:r>
+            <w:r>
+              <w:rPr>
+                <w:b/>
+                <w:lang w:val="ru-RU"/>
+              </w:rPr>
+              <w:t>флориста Яны</w:t>
+            </w:r>
+            <w:r>
+              <w:rPr>
+                <w:b/>
+                <w:lang w:val="ru-RU"/>
+              </w:rPr>
+              <w:t xml:space="preserve"> Прокудиной</w:t>
             </w:r>
           </w:p>
         </w:tc>
@@ -1153,6 +1178,7 @@
               <w:widowControl w:val="0"/>
               <w:rPr>
                 <w:rFonts w:ascii="Calibri" w:eastAsia="Calibri" w:hAnsi="Calibri" w:cs="Calibri"/>
+                <w:lang w:val="ru-RU"/>
               </w:rPr>
             </w:pPr>
             <w:r>
@@ -1166,6 +1192,12 @@
             </w:r>
             <w:r>
               <w:t xml:space="preserve"> STEAM</w:t>
+            </w:r>
+            <w:r>
+              <w:rPr>
+                <w:lang w:val="ru-RU"/>
+              </w:rPr>
+              <w:t xml:space="preserve"> и робототехника</w:t>
             </w:r>
           </w:p>
         </w:tc>
@@ -1257,7 +1289,25 @@
               <w:rPr>
                 <w:lang w:val="ru-RU"/>
               </w:rPr>
-              <w:t xml:space="preserve">Мастер класс по робототехнике от </w:t>
+              <w:t>Мастер класс по робототехнике от</w:t>
+            </w:r>
+            <w:r>
+              <w:t xml:space="preserve"> </w:t>
+            </w:r>
+            <w:proofErr w:type="spellStart"/>
+            <w:r>
+              <w:rPr>
+                <w:b/>
+                <w:lang w:val="ru-RU"/>
+              </w:rPr>
+              <w:t>Nazar</w:t>
+            </w:r>
+            <w:proofErr w:type="spellEnd"/>
+            <w:r>
+              <w:rPr>
+                <w:lang w:val="ru-RU"/>
+              </w:rPr>
+              <w:t xml:space="preserve"> </w:t>
             </w:r>
             <w:r>
               <w:rPr>
@@ -1269,19 +1319,6 @@
             <w:r>
               <w:rPr>
                 <w:b/>
-                <w:lang w:val="ru-RU"/>
-              </w:rPr>
-              <w:t xml:space="preserve"> </w:t>
-            </w:r>
-            <w:r>
-              <w:rPr>
-                <w:b/>
-                <w:lang w:val="en-US"/>
-              </w:rPr>
-              <w:t>Inventor</w:t>
-            </w:r>
-            <w:r>
-              <w:rPr>
                 <w:lang w:val="ru-RU"/>
               </w:rPr>
               <w:t xml:space="preserve"> </w:t>
@@ -1764,52 +1801,52 @@
                 <w:sz w:val="24"/>
                 <w:szCs w:val="24"/>
               </w:rPr>
-              <w:t xml:space="preserve"> яблон</w:t>
-            </w:r>
+              <w:t xml:space="preserve"> </w:t>
+            </w:r>
+            <w:proofErr w:type="spellStart"/>
             <w:r>
               <w:rPr>
                 <w:rFonts w:ascii="Calibri" w:eastAsia="Calibri" w:hAnsi="Calibri" w:cs="Calibri"/>
                 <w:sz w:val="24"/>
                 <w:szCs w:val="24"/>
-                <w:lang w:val="ru-RU"/>
-              </w:rPr>
-              <w:t>и</w:t>
-            </w:r>
+              </w:rPr>
+              <w:t>яблон</w:t>
+            </w:r>
+            <w:proofErr w:type="spellEnd"/>
             <w:r>
               <w:rPr>
                 <w:rFonts w:ascii="Calibri" w:eastAsia="Calibri" w:hAnsi="Calibri" w:cs="Calibri"/>
                 <w:sz w:val="24"/>
                 <w:szCs w:val="24"/>
-              </w:rPr>
-              <w:t xml:space="preserve"> Сиверса </w:t>
+                <w:lang w:val="ru-RU"/>
+              </w:rPr>
+              <w:t>и</w:t>
             </w:r>
             <w:r>
               <w:rPr>
                 <w:rFonts w:ascii="Calibri" w:eastAsia="Calibri" w:hAnsi="Calibri" w:cs="Calibri"/>
                 <w:sz w:val="24"/>
                 <w:szCs w:val="24"/>
-                <w:lang w:val="ru-RU"/>
-              </w:rPr>
-              <w:t>от</w:t>
+              </w:rPr>
+              <w:t xml:space="preserve"> Сиверса</w:t>
             </w:r>
             <w:r>
               <w:rPr>
                 <w:rFonts w:ascii="Calibri" w:eastAsia="Calibri" w:hAnsi="Calibri" w:cs="Calibri"/>
                 <w:sz w:val="24"/>
                 <w:szCs w:val="24"/>
-              </w:rPr>
-              <w:t xml:space="preserve"> </w:t>
-            </w:r>
-            <w:r>
-              <w:rPr>
-                <w:rFonts w:ascii="Calibri" w:eastAsia="Calibri" w:hAnsi="Calibri" w:cs="Calibri"/>
-                <w:b/>
+                <w:lang w:val="ru-RU"/>
+              </w:rPr>
+              <w:t xml:space="preserve"> с</w:t>
+            </w:r>
+            <w:r>
+              <w:rPr>
+                <w:rFonts w:ascii="Calibri" w:eastAsia="Calibri" w:hAnsi="Calibri" w:cs="Calibri"/>
                 <w:sz w:val="24"/>
                 <w:szCs w:val="24"/>
               </w:rPr>
-              <w:t xml:space="preserve">Бригитте </w:t>
-            </w:r>
-            <w:proofErr w:type="spellStart"/>
+              <w:t xml:space="preserve"> </w:t>
+            </w:r>
             <w:r>
               <w:rPr>
                 <w:rFonts w:ascii="Calibri" w:eastAsia="Calibri" w:hAnsi="Calibri" w:cs="Calibri"/>
@@ -1817,72 +1854,80 @@
                 <w:sz w:val="24"/>
                 <w:szCs w:val="24"/>
               </w:rPr>
-              <w:t>Хофхерр</w:t>
-            </w:r>
-            <w:proofErr w:type="spellEnd"/>
-            <w:r>
-              <w:rPr>
-                <w:rFonts w:ascii="Calibri" w:eastAsia="Calibri" w:hAnsi="Calibri" w:cs="Calibri"/>
+              <w:t xml:space="preserve">Бригитте </w:t>
+            </w:r>
+            <w:proofErr w:type="spellStart"/>
+            <w:r>
+              <w:rPr>
+                <w:rFonts w:ascii="Calibri" w:eastAsia="Calibri" w:hAnsi="Calibri" w:cs="Calibri"/>
+                <w:b/>
                 <w:sz w:val="24"/>
                 <w:szCs w:val="24"/>
               </w:rPr>
-              <w:t xml:space="preserve"> (Германия) </w:t>
-            </w:r>
+              <w:t>Хоферр</w:t>
+            </w:r>
+            <w:proofErr w:type="spellEnd"/>
             <w:r>
               <w:rPr>
                 <w:rFonts w:ascii="Calibri" w:eastAsia="Calibri" w:hAnsi="Calibri" w:cs="Calibri"/>
                 <w:sz w:val="24"/>
                 <w:szCs w:val="24"/>
-                <w:lang w:val="ru-RU"/>
-              </w:rPr>
-              <w:t>с</w:t>
+              </w:rPr>
+              <w:t xml:space="preserve"> (Германия) </w:t>
             </w:r>
             <w:r>
               <w:rPr>
                 <w:rFonts w:ascii="Calibri" w:eastAsia="Calibri" w:hAnsi="Calibri" w:cs="Calibri"/>
                 <w:sz w:val="24"/>
                 <w:szCs w:val="24"/>
-              </w:rPr>
-              <w:t xml:space="preserve"> 14:00 до 16:00</w:t>
-            </w:r>
-          </w:p>
-          <w:p>
-            <w:pPr>
-              <w:spacing w:line="240" w:lineRule="auto"/>
+                <w:lang w:val="ru-RU"/>
+              </w:rPr>
+              <w:t xml:space="preserve">от </w:t>
+            </w:r>
+            <w:r>
               <w:rPr>
                 <w:rFonts w:ascii="Calibri" w:eastAsia="Calibri" w:hAnsi="Calibri" w:cs="Calibri"/>
                 <w:b/>
                 <w:sz w:val="24"/>
                 <w:szCs w:val="24"/>
-                <w:lang w:val="en-US"/>
-              </w:rPr>
-            </w:pPr>
-            <w:r>
-              <w:rPr>
-                <w:rFonts w:ascii="Calibri" w:eastAsia="Calibri" w:hAnsi="Calibri" w:cs="Calibri"/>
+                <w:lang w:val="ru-RU"/>
+              </w:rPr>
+              <w:t>ОФ «</w:t>
+            </w:r>
+            <w:proofErr w:type="spellStart"/>
+            <w:r>
+              <w:rPr>
+                <w:rFonts w:ascii="Calibri" w:eastAsia="Calibri" w:hAnsi="Calibri" w:cs="Calibri"/>
+                <w:b/>
                 <w:sz w:val="24"/>
                 <w:szCs w:val="24"/>
-              </w:rPr>
-              <w:t xml:space="preserve">- </w:t>
-            </w:r>
-            <w:r>
-              <w:rPr>
-                <w:rFonts w:ascii="Calibri" w:eastAsia="Calibri" w:hAnsi="Calibri" w:cs="Calibri"/>
+                <w:lang w:val="ru-RU"/>
+              </w:rPr>
+              <w:t>Алмалы</w:t>
+            </w:r>
+            <w:proofErr w:type="spellEnd"/>
+            <w:r>
+              <w:rPr>
+                <w:rFonts w:ascii="Calibri" w:eastAsia="Calibri" w:hAnsi="Calibri" w:cs="Calibri"/>
+                <w:b/>
                 <w:sz w:val="24"/>
                 <w:szCs w:val="24"/>
                 <w:lang w:val="ru-RU"/>
               </w:rPr>
-              <w:t xml:space="preserve">Мастер-классы по рисованию от </w:t>
-            </w:r>
+              <w:t xml:space="preserve"> </w:t>
+            </w:r>
+            <w:proofErr w:type="spellStart"/>
             <w:r>
               <w:rPr>
                 <w:rFonts w:ascii="Calibri" w:eastAsia="Calibri" w:hAnsi="Calibri" w:cs="Calibri"/>
                 <w:b/>
                 <w:sz w:val="24"/>
                 <w:szCs w:val="24"/>
-              </w:rPr>
-              <w:t>Центр</w:t>
-            </w:r>
+                <w:lang w:val="ru-RU"/>
+              </w:rPr>
+              <w:t>Жумак</w:t>
+            </w:r>
+            <w:proofErr w:type="spellEnd"/>
             <w:r>
               <w:rPr>
                 <w:rFonts w:ascii="Calibri" w:eastAsia="Calibri" w:hAnsi="Calibri" w:cs="Calibri"/>
@@ -1891,102 +1936,90 @@
                 <w:szCs w:val="24"/>
                 <w:lang w:val="ru-RU"/>
               </w:rPr>
-              <w:t>а</w:t>
-            </w:r>
-            <w:r>
-              <w:rPr>
-                <w:rFonts w:ascii="Calibri" w:eastAsia="Calibri" w:hAnsi="Calibri" w:cs="Calibri"/>
-                <w:b/>
+              <w:t>»</w:t>
+            </w:r>
+            <w:r>
+              <w:rPr>
+                <w:rFonts w:ascii="Calibri" w:eastAsia="Calibri" w:hAnsi="Calibri" w:cs="Calibri"/>
                 <w:sz w:val="24"/>
                 <w:szCs w:val="24"/>
-              </w:rPr>
-              <w:t xml:space="preserve"> социальной поддержки людей с инвалидностью «</w:t>
-            </w:r>
-            <w:proofErr w:type="spellStart"/>
-            <w:r>
-              <w:rPr>
-                <w:rFonts w:ascii="Calibri" w:eastAsia="Calibri" w:hAnsi="Calibri" w:cs="Calibri"/>
-                <w:b/>
+                <w:lang w:val="ru-RU"/>
+              </w:rPr>
+              <w:t xml:space="preserve"> </w:t>
+            </w:r>
+            <w:r>
+              <w:rPr>
+                <w:rFonts w:ascii="Calibri" w:eastAsia="Calibri" w:hAnsi="Calibri" w:cs="Calibri"/>
                 <w:sz w:val="24"/>
                 <w:szCs w:val="24"/>
-              </w:rPr>
-              <w:t>Ten</w:t>
-            </w:r>
-            <w:proofErr w:type="spellEnd"/>
-            <w:r>
-              <w:rPr>
-                <w:rFonts w:ascii="Calibri" w:eastAsia="Calibri" w:hAnsi="Calibri" w:cs="Calibri"/>
-                <w:b/>
+                <w:lang w:val="ru-RU"/>
+              </w:rPr>
+              <w:t>с</w:t>
+            </w:r>
+            <w:r>
+              <w:rPr>
+                <w:rFonts w:ascii="Calibri" w:eastAsia="Calibri" w:hAnsi="Calibri" w:cs="Calibri"/>
                 <w:sz w:val="24"/>
                 <w:szCs w:val="24"/>
               </w:rPr>
-              <w:t xml:space="preserve"> </w:t>
-            </w:r>
-            <w:proofErr w:type="spellStart"/>
-            <w:r>
+              <w:t xml:space="preserve"> 14:00 до 16:00</w:t>
+            </w:r>
+          </w:p>
+          <w:p>
+            <w:pPr>
+              <w:spacing w:line="240" w:lineRule="auto"/>
               <w:rPr>
                 <w:rFonts w:ascii="Calibri" w:eastAsia="Calibri" w:hAnsi="Calibri" w:cs="Calibri"/>
                 <w:b/>
                 <w:sz w:val="24"/>
                 <w:szCs w:val="24"/>
-              </w:rPr>
-              <w:t>Qogam</w:t>
-            </w:r>
-            <w:proofErr w:type="spellEnd"/>
-            <w:r>
-              <w:rPr>
-                <w:rFonts w:ascii="Calibri" w:eastAsia="Calibri" w:hAnsi="Calibri" w:cs="Calibri"/>
-                <w:b/>
+                <w:lang w:val="ru-RU"/>
+              </w:rPr>
+            </w:pPr>
+            <w:r>
+              <w:rPr>
+                <w:rFonts w:ascii="Calibri" w:eastAsia="Calibri" w:hAnsi="Calibri" w:cs="Calibri"/>
                 <w:sz w:val="24"/>
                 <w:szCs w:val="24"/>
               </w:rPr>
-              <w:t>»</w:t>
-            </w:r>
-          </w:p>
-          <w:p>
-            <w:pPr>
-              <w:spacing w:line="240" w:lineRule="auto"/>
-              <w:rPr>
-                <w:lang w:val="ru-RU"/>
-              </w:rPr>
-            </w:pPr>
+              <w:t xml:space="preserve">- </w:t>
+            </w:r>
             <w:r>
               <w:rPr>
                 <w:rFonts w:ascii="Calibri" w:eastAsia="Calibri" w:hAnsi="Calibri" w:cs="Calibri"/>
                 <w:sz w:val="24"/>
                 <w:szCs w:val="24"/>
-              </w:rPr>
-              <w:t xml:space="preserve">- </w:t>
-            </w:r>
-            <w:r>
-              <w:rPr>
-                <w:rFonts w:ascii="Calibri" w:eastAsia="Calibri" w:hAnsi="Calibri" w:cs="Calibri"/>
+                <w:lang w:val="ru-RU"/>
+              </w:rPr>
+              <w:t xml:space="preserve">Мастер-классы по рисованию от </w:t>
+            </w:r>
+            <w:r>
+              <w:rPr>
+                <w:rFonts w:ascii="Calibri" w:eastAsia="Calibri" w:hAnsi="Calibri" w:cs="Calibri"/>
+                <w:b/>
                 <w:sz w:val="24"/>
                 <w:szCs w:val="24"/>
-                <w:lang w:val="ru-RU"/>
-              </w:rPr>
-              <w:t xml:space="preserve">Создаем открытки с элементами валяния от </w:t>
-            </w:r>
-            <w:proofErr w:type="spellStart"/>
+              </w:rPr>
+              <w:t>Центр</w:t>
+            </w:r>
             <w:r>
               <w:rPr>
                 <w:rFonts w:ascii="Calibri" w:eastAsia="Calibri" w:hAnsi="Calibri" w:cs="Calibri"/>
                 <w:b/>
                 <w:sz w:val="24"/>
                 <w:szCs w:val="24"/>
-              </w:rPr>
-              <w:t>Айжан</w:t>
-            </w:r>
-            <w:proofErr w:type="spellEnd"/>
+                <w:lang w:val="ru-RU"/>
+              </w:rPr>
+              <w:t>а</w:t>
+            </w:r>
             <w:r>
               <w:rPr>
                 <w:rFonts w:ascii="Calibri" w:eastAsia="Calibri" w:hAnsi="Calibri" w:cs="Calibri"/>
                 <w:b/>
                 <w:sz w:val="24"/>
                 <w:szCs w:val="24"/>
-                <w:lang w:val="ru-RU"/>
-              </w:rPr>
-              <w:t xml:space="preserve"> </w:t>
+              </w:rPr>
+              <w:t xml:space="preserve"> социальной поддержки людей с инвалидностью «</w:t>
             </w:r>
             <w:proofErr w:type="spellStart"/>
             <w:r>
@@ -1995,9 +2028,95 @@
                 <w:b/>
                 <w:sz w:val="24"/>
                 <w:szCs w:val="24"/>
-                <w:lang w:val="ru-RU"/>
-              </w:rPr>
-              <w:t>Бекккуловой</w:t>
+              </w:rPr>
+              <w:t>Ten</w:t>
+            </w:r>
+            <w:proofErr w:type="spellEnd"/>
+            <w:r>
+              <w:rPr>
+                <w:rFonts w:ascii="Calibri" w:eastAsia="Calibri" w:hAnsi="Calibri" w:cs="Calibri"/>
+                <w:b/>
+                <w:sz w:val="24"/>
+                <w:szCs w:val="24"/>
+              </w:rPr>
+              <w:t xml:space="preserve"> </w:t>
+            </w:r>
+            <w:proofErr w:type="spellStart"/>
+            <w:r>
+              <w:rPr>
+                <w:rFonts w:ascii="Calibri" w:eastAsia="Calibri" w:hAnsi="Calibri" w:cs="Calibri"/>
+                <w:b/>
+                <w:sz w:val="24"/>
+                <w:szCs w:val="24"/>
+              </w:rPr>
+              <w:t>Qogam</w:t>
+            </w:r>
+            <w:proofErr w:type="spellEnd"/>
+            <w:r>
+              <w:rPr>
+                <w:rFonts w:ascii="Calibri" w:eastAsia="Calibri" w:hAnsi="Calibri" w:cs="Calibri"/>
+                <w:b/>
+                <w:sz w:val="24"/>
+                <w:szCs w:val="24"/>
+              </w:rPr>
+              <w:t>»</w:t>
+            </w:r>
+          </w:p>
+          <w:p>
+            <w:pPr>
+              <w:spacing w:line="240" w:lineRule="auto"/>
+              <w:rPr>
+                <w:lang w:val="ru-RU"/>
+              </w:rPr>
+            </w:pPr>
+            <w:r>
+              <w:rPr>
+                <w:rFonts w:ascii="Calibri" w:eastAsia="Calibri" w:hAnsi="Calibri" w:cs="Calibri"/>
+                <w:sz w:val="24"/>
+                <w:szCs w:val="24"/>
+              </w:rPr>
+              <w:t xml:space="preserve">- </w:t>
+            </w:r>
+            <w:r>
+              <w:rPr>
+                <w:rFonts w:ascii="Calibri" w:eastAsia="Calibri" w:hAnsi="Calibri" w:cs="Calibri"/>
+                <w:sz w:val="24"/>
+                <w:szCs w:val="24"/>
+                <w:lang w:val="ru-RU"/>
+              </w:rPr>
+              <w:t xml:space="preserve">Создаем открытки с элементами валяния от </w:t>
+            </w:r>
+            <w:proofErr w:type="spellStart"/>
+            <w:r>
+              <w:rPr>
+                <w:rFonts w:ascii="Calibri" w:eastAsia="Calibri" w:hAnsi="Calibri" w:cs="Calibri"/>
+                <w:b/>
+                <w:sz w:val="24"/>
+                <w:szCs w:val="24"/>
+              </w:rPr>
+              <w:t>Айжан</w:t>
+            </w:r>
+            <w:proofErr w:type="spellEnd"/>
+            <w:r>
+              <w:rPr>
+                <w:rFonts w:ascii="Calibri" w:eastAsia="Calibri" w:hAnsi="Calibri" w:cs="Calibri"/>
+                <w:b/>
+                <w:sz w:val="24"/>
+                <w:szCs w:val="24"/>
+                <w:lang w:val="ru-RU"/>
+              </w:rPr>
+              <w:t xml:space="preserve"> </w:t>
+            </w:r>
+            <w:proofErr w:type="spellStart"/>
+            <w:r>
+              <w:rPr>
+                <w:rFonts w:ascii="Calibri" w:eastAsia="Calibri" w:hAnsi="Calibri" w:cs="Calibri"/>
+                <w:b/>
+                <w:sz w:val="24"/>
+                <w:szCs w:val="24"/>
+                <w:lang w:val="ru-RU"/>
+              </w:rPr>
+              <w:t>Беккуловой</w:t>
             </w:r>
             <w:proofErr w:type="spellEnd"/>
           </w:p>
@@ -2060,13 +2179,7 @@
               <w:rPr>
                 <w:lang w:val="ru-RU"/>
               </w:rPr>
-              <w:t xml:space="preserve"> горшечных растений о</w:t>
-            </w:r>
-            <w:r>
-              <w:rPr>
-                <w:lang w:val="ru-RU"/>
-              </w:rPr>
-              <w:t xml:space="preserve">т лаборатории тропических и субтропических растений Института Ботаники и Фитоинтродукции </w:t>
+              <w:t xml:space="preserve"> горшечных растений от лаборатории тропических и субтропических растений Института Ботаники и Фитоинтродукции </w:t>
             </w:r>
           </w:p>
         </w:tc>
@@ -2094,10 +2207,23 @@
               <w:widowControl w:val="0"/>
               <w:rPr>
                 <w:rFonts w:ascii="Calibri" w:eastAsia="Calibri" w:hAnsi="Calibri" w:cs="Calibri"/>
+                <w:lang w:val="ru-RU"/>
               </w:rPr>
             </w:pPr>
             <w:r>
               <w:t>Выставка картин</w:t>
+            </w:r>
+            <w:r>
+              <w:rPr>
+                <w:lang w:val="kk-KZ"/>
+              </w:rPr>
+              <w:t xml:space="preserve"> </w:t>
+            </w:r>
+            <w:r>
+              <w:rPr>
+                <w:lang w:val="ru-RU"/>
+              </w:rPr>
+              <w:t>(на перголах)</w:t>
             </w:r>
           </w:p>
         </w:tc>
@@ -2127,26 +2253,45 @@
               <w:t xml:space="preserve">Выставка картин от </w:t>
             </w:r>
             <w:r>
-              <w:t>Центра социальной поддержки людей с инвалидностью «</w:t>
-            </w:r>
-            <w:proofErr w:type="spellStart"/>
-            <w:r>
+              <w:t xml:space="preserve">Центра социальной поддержки людей с инвалидностью </w:t>
+            </w:r>
+            <w:r>
+              <w:rPr>
+                <w:b/>
+              </w:rPr>
+              <w:t>«</w:t>
+            </w:r>
+            <w:proofErr w:type="spellStart"/>
+            <w:r>
+              <w:rPr>
+                <w:b/>
+              </w:rPr>
               <w:t>Ten</w:t>
             </w:r>
             <w:proofErr w:type="spellEnd"/>
             <w:r>
-              <w:t xml:space="preserve"> </w:t>
-            </w:r>
-            <w:proofErr w:type="spellStart"/>
-            <w:r>
+              <w:rPr>
+                <w:b/>
+              </w:rPr>
+              <w:t xml:space="preserve"> </w:t>
+            </w:r>
+            <w:proofErr w:type="spellStart"/>
+            <w:r>
+              <w:rPr>
+                <w:b/>
+              </w:rPr>
               <w:t>Qogam</w:t>
             </w:r>
             <w:proofErr w:type="spellEnd"/>
             <w:r>
+              <w:rPr>
+                <w:b/>
+              </w:rPr>
               <w:t>»</w:t>
             </w:r>
             <w:r>
               <w:rPr>
+                <w:b/>
                 <w:lang w:val="ru-RU"/>
               </w:rPr>
               <w:t xml:space="preserve">, </w:t>
@@ -2154,6 +2299,7 @@
             <w:proofErr w:type="spellStart"/>
             <w:r>
               <w:rPr>
+                <w:b/>
                 <w:lang w:val="ru-RU"/>
               </w:rPr>
               <w:t>Анар</w:t>
@@ -2161,13 +2307,15 @@
             <w:proofErr w:type="spellEnd"/>
             <w:r>
               <w:rPr>
-                <w:lang w:val="ru-RU"/>
-              </w:rPr>
-              <w:t xml:space="preserve"> </w:t>
-            </w:r>
-            <w:proofErr w:type="spellStart"/>
-            <w:r>
-              <w:rPr>
+                <w:b/>
+                <w:lang w:val="ru-RU"/>
+              </w:rPr>
+              <w:t xml:space="preserve"> </w:t>
+            </w:r>
+            <w:proofErr w:type="spellStart"/>
+            <w:r>
+              <w:rPr>
+                <w:b/>
                 <w:lang w:val="ru-RU"/>
               </w:rPr>
               <w:t>Абжановой</w:t>
@@ -2175,31 +2323,29 @@
             <w:proofErr w:type="spellEnd"/>
             <w:r>
               <w:rPr>
+                <w:b/>
                 <w:lang w:val="ru-RU"/>
               </w:rPr>
               <w:t xml:space="preserve">, </w:t>
             </w:r>
             <w:r>
-              <w:t>Центр</w:t>
-            </w:r>
-            <w:r>
-              <w:rPr>
-                <w:lang w:val="ru-RU"/>
-              </w:rPr>
-              <w:t>а</w:t>
-            </w:r>
-            <w:r>
-              <w:t xml:space="preserve"> реабилитации для детей с аутизмом</w:t>
-            </w:r>
-            <w:r>
-              <w:rPr>
-                <w:lang w:val="ru-RU"/>
-              </w:rPr>
-              <w:t xml:space="preserve"> «</w:t>
-            </w:r>
-            <w:proofErr w:type="spellStart"/>
-            <w:r>
-              <w:rPr>
+              <w:rPr>
+                <w:b/>
+                <w:lang w:val="ru-RU"/>
+              </w:rPr>
+              <w:t>А</w:t>
+            </w:r>
+            <w:r>
+              <w:rPr>
+                <w:b/>
+                <w:lang w:val="ru-RU"/>
+              </w:rPr>
+              <w:t>утизм центров и Ресурсного центра "</w:t>
+            </w:r>
+            <w:proofErr w:type="spellStart"/>
+            <w:r>
+              <w:rPr>
+                <w:b/>
                 <w:lang w:val="ru-RU"/>
               </w:rPr>
               <w:t>Асыл</w:t>
@@ -2207,13 +2353,15 @@
             <w:proofErr w:type="spellEnd"/>
             <w:r>
               <w:rPr>
-                <w:lang w:val="ru-RU"/>
-              </w:rPr>
-              <w:t xml:space="preserve"> </w:t>
-            </w:r>
-            <w:proofErr w:type="spellStart"/>
-            <w:r>
-              <w:rPr>
+                <w:b/>
+                <w:lang w:val="ru-RU"/>
+              </w:rPr>
+              <w:t xml:space="preserve"> </w:t>
+            </w:r>
+            <w:proofErr w:type="spellStart"/>
+            <w:r>
+              <w:rPr>
+                <w:b/>
                 <w:lang w:val="ru-RU"/>
               </w:rPr>
               <w:t>Мирас</w:t>
@@ -2221,9 +2369,32 @@
             <w:proofErr w:type="spellEnd"/>
             <w:r>
               <w:rPr>
-                <w:lang w:val="ru-RU"/>
-              </w:rPr>
-              <w:t>»</w:t>
+                <w:b/>
+                <w:lang w:val="ru-RU"/>
+              </w:rPr>
+              <w:t xml:space="preserve">" </w:t>
+            </w:r>
+            <w:r>
+              <w:rPr>
+                <w:b/>
+                <w:lang w:val="ru-RU"/>
+              </w:rPr>
+              <w:t xml:space="preserve">Фонда Булата </w:t>
+            </w:r>
+            <w:proofErr w:type="spellStart"/>
+            <w:r>
+              <w:rPr>
+                <w:b/>
+                <w:lang w:val="ru-RU"/>
+              </w:rPr>
+              <w:t>Утемуратова</w:t>
+            </w:r>
+            <w:proofErr w:type="spellEnd"/>
+            <w:r>
+              <w:rPr>
+                <w:lang w:val="ru-RU"/>
+              </w:rPr>
+              <w:t xml:space="preserve"> </w:t>
             </w:r>
           </w:p>
         </w:tc>
@@ -2251,11 +2422,18 @@
               <w:widowControl w:val="0"/>
               <w:rPr>
                 <w:rFonts w:ascii="Calibri" w:eastAsia="Calibri" w:hAnsi="Calibri" w:cs="Calibri"/>
+                <w:lang w:val="ru-RU"/>
               </w:rPr>
             </w:pPr>
             <w:r>
               <w:lastRenderedPageBreak/>
               <w:t>Выставка детских поделок</w:t>
+            </w:r>
+            <w:r>
+              <w:rPr>
+                <w:lang w:val="ru-RU"/>
+              </w:rPr>
+              <w:t xml:space="preserve"> (на перголах)</w:t>
             </w:r>
           </w:p>
         </w:tc>
@@ -2359,37 +2537,89 @@
               <w:rPr>
                 <w:lang w:val="ru-RU"/>
               </w:rPr>
-              <w:t xml:space="preserve"> инклюзивный показ мод в э</w:t>
-            </w:r>
-            <w:r>
-              <w:t>ко-</w:t>
-            </w:r>
-            <w:proofErr w:type="spellStart"/>
-            <w:r>
-              <w:t>этно</w:t>
-            </w:r>
-            <w:proofErr w:type="spellEnd"/>
-            <w:r>
-              <w:t xml:space="preserve"> </w:t>
-            </w:r>
-            <w:proofErr w:type="spellStart"/>
-            <w:r>
-              <w:t>стил</w:t>
-            </w:r>
-            <w:proofErr w:type="spellEnd"/>
-            <w:r>
-              <w:rPr>
-                <w:lang w:val="ru-RU"/>
-              </w:rPr>
-              <w:t xml:space="preserve">е от </w:t>
-            </w:r>
-            <w:proofErr w:type="spellStart"/>
-            <w:r>
-              <w:rPr>
-                <w:highlight w:val="yellow"/>
-                <w:lang w:val="ru-RU"/>
-              </w:rPr>
-              <w:t>Ботагоз</w:t>
+              <w:t xml:space="preserve"> инклюзивный показ мод</w:t>
+            </w:r>
+            <w:r>
+              <w:rPr>
+                <w:lang w:val="ru-RU"/>
+              </w:rPr>
+              <w:t xml:space="preserve"> в </w:t>
+            </w:r>
+            <w:r>
+              <w:rPr>
+                <w:lang w:val="ru-RU"/>
+              </w:rPr>
+              <w:t>эко этно-</w:t>
+            </w:r>
+            <w:r>
+              <w:rPr>
+                <w:lang w:val="ru-RU"/>
+              </w:rPr>
+              <w:t>стиле от д</w:t>
+            </w:r>
+            <w:r>
+              <w:rPr>
+                <w:lang w:val="ru-RU"/>
+              </w:rPr>
+              <w:t>изайнер</w:t>
+            </w:r>
+            <w:r>
+              <w:rPr>
+                <w:lang w:val="ru-RU"/>
+              </w:rPr>
+              <w:t>а-</w:t>
+            </w:r>
+            <w:proofErr w:type="spellStart"/>
+            <w:r>
+              <w:rPr>
+                <w:lang w:val="ru-RU"/>
+              </w:rPr>
+              <w:t>апсйклера</w:t>
+            </w:r>
+            <w:proofErr w:type="spellEnd"/>
+            <w:r>
+              <w:rPr>
+                <w:lang w:val="ru-RU"/>
+              </w:rPr>
+              <w:t xml:space="preserve"> и </w:t>
+            </w:r>
+            <w:proofErr w:type="spellStart"/>
+            <w:r>
+              <w:rPr>
+                <w:lang w:val="ru-RU"/>
+              </w:rPr>
+              <w:t>костомайзера</w:t>
+            </w:r>
+            <w:proofErr w:type="spellEnd"/>
+            <w:r>
+              <w:rPr>
+                <w:lang w:val="ru-RU"/>
+              </w:rPr>
+              <w:t xml:space="preserve"> </w:t>
+            </w:r>
+            <w:proofErr w:type="spellStart"/>
+            <w:r>
+              <w:rPr>
+                <w:b/>
+                <w:lang w:val="ru-RU"/>
+              </w:rPr>
+              <w:t>Ботакоз</w:t>
+            </w:r>
+            <w:proofErr w:type="spellEnd"/>
+            <w:r>
+              <w:rPr>
+                <w:b/>
+                <w:lang w:val="ru-RU"/>
+              </w:rPr>
+              <w:t xml:space="preserve"> </w:t>
+            </w:r>
+            <w:proofErr w:type="spellStart"/>
+            <w:r>
+              <w:rPr>
+                <w:b/>
+                <w:lang w:val="ru-RU"/>
+              </w:rPr>
+              <w:t>Садыбековой</w:t>
             </w:r>
             <w:proofErr w:type="spellEnd"/>
           </w:p>
@@ -2454,10 +2684,136 @@
               <w:rPr>
                 <w:lang w:val="ru-RU"/>
               </w:rPr>
-              <w:t xml:space="preserve">Главный </w:t>
-            </w:r>
-            <w:r>
-              <w:t>Ботанический Сад Алматы</w:t>
+              <w:t xml:space="preserve">Сказочное аудио-путешествие по ботаническому саду Алматы для детей от </w:t>
+            </w:r>
+            <w:r>
+              <w:rPr>
+                <w:lang w:val="ru-RU"/>
+              </w:rPr>
+              <w:t>9</w:t>
+            </w:r>
+            <w:r>
+              <w:rPr>
+                <w:lang w:val="ru-RU"/>
+              </w:rPr>
+              <w:t xml:space="preserve">+. Для прохождения </w:t>
+            </w:r>
+            <w:proofErr w:type="spellStart"/>
+            <w:r>
+              <w:rPr>
+                <w:lang w:val="ru-RU"/>
+              </w:rPr>
+              <w:t>аудиотура</w:t>
+            </w:r>
+            <w:proofErr w:type="spellEnd"/>
+            <w:r>
+              <w:rPr>
+                <w:lang w:val="ru-RU"/>
+              </w:rPr>
+              <w:t xml:space="preserve"> нужен смартфон и наушники. </w:t>
+            </w:r>
+            <w:r>
+              <w:rPr>
+                <w:lang w:val="ru-RU"/>
+              </w:rPr>
+              <w:t xml:space="preserve">Аудиотур был создан при поддержке компании «Шеврон» </w:t>
+            </w:r>
+          </w:p>
+        </w:tc>
+      </w:tr>
+      <w:tr>
+        <w:tc>
+          <w:tcPr>
+            <w:tcW w:w="2748" w:type="dxa"/>
+            <w:tcBorders>
+              <w:top w:val="single" w:sz="4" w:space="0" w:color="CCCCCC"/>
+              <w:left w:val="single" w:sz="4" w:space="0" w:color="000000"/>
+              <w:bottom w:val="single" w:sz="4" w:space="0" w:color="CCCCCC"/>
+              <w:right w:val="single" w:sz="4" w:space="0" w:color="000000"/>
+            </w:tcBorders>
+            <w:tcMar>
+              <w:top w:w="0" w:type="dxa"/>
+              <w:left w:w="40" w:type="dxa"/>
+              <w:bottom w:w="0" w:type="dxa"/>
+              <w:right w:w="40" w:type="dxa"/>
+            </w:tcMar>
+            <w:vAlign w:val="center"/>
+          </w:tcPr>
+          <w:p>
+            <w:pPr>
+              <w:widowControl w:val="0"/>
+              <w:rPr>
+                <w:rFonts w:ascii="Calibri" w:eastAsia="Calibri" w:hAnsi="Calibri" w:cs="Calibri"/>
+              </w:rPr>
+            </w:pPr>
+            <w:r>
+              <w:t>Входной павильон - Проведение экскурсий по ботаническому саду</w:t>
+            </w:r>
+          </w:p>
+        </w:tc>
+        <w:tc>
+          <w:tcPr>
+            <w:tcW w:w="8247" w:type="dxa"/>
+            <w:shd w:val="clear" w:color="auto" w:fill="auto"/>
+            <w:tcMar>
+              <w:top w:w="100" w:type="dxa"/>
+              <w:left w:w="100" w:type="dxa"/>
+              <w:bottom w:w="100" w:type="dxa"/>
+              <w:right w:w="100" w:type="dxa"/>
+            </w:tcMar>
+            <w:vAlign w:val="center"/>
+          </w:tcPr>
+          <w:p>
+            <w:pPr>
+              <w:spacing w:line="240" w:lineRule="auto"/>
+              <w:rPr>
+                <w:lang w:val="ru-RU"/>
+              </w:rPr>
+            </w:pPr>
+            <w:r>
+              <w:rPr>
+                <w:lang w:val="ru-RU"/>
+              </w:rPr>
+              <w:t xml:space="preserve">Экскурсии с гидами – научными сотрудниками Института Ботаники и Фитоинтродукции по коллекциям </w:t>
+            </w:r>
+            <w:r>
+              <w:rPr>
+                <w:lang w:val="ru-RU"/>
+              </w:rPr>
+              <w:t>Главн</w:t>
+            </w:r>
+            <w:r>
+              <w:rPr>
+                <w:lang w:val="ru-RU"/>
+              </w:rPr>
+              <w:t xml:space="preserve">ого </w:t>
+            </w:r>
+            <w:r>
+              <w:t>Ботаническ</w:t>
+            </w:r>
+            <w:r>
+              <w:rPr>
+                <w:lang w:val="ru-RU"/>
+              </w:rPr>
+              <w:t>ого</w:t>
+            </w:r>
+            <w:r>
+              <w:t xml:space="preserve"> Сад</w:t>
+            </w:r>
+            <w:r>
+              <w:rPr>
+                <w:lang w:val="ru-RU"/>
+              </w:rPr>
+              <w:t>а</w:t>
+            </w:r>
+            <w:r>
+              <w:t xml:space="preserve"> Алматы</w:t>
+            </w:r>
+            <w:r>
+              <w:rPr>
+                <w:lang w:val="ru-RU"/>
+              </w:rPr>
+              <w:t>. Группы на русском и казахском языках.</w:t>
             </w:r>
           </w:p>
         </w:tc>
@@ -2484,11 +2840,26 @@
             <w:pPr>
               <w:widowControl w:val="0"/>
               <w:rPr>
-                <w:rFonts w:ascii="Calibri" w:eastAsia="Calibri" w:hAnsi="Calibri" w:cs="Calibri"/>
-              </w:rPr>
-            </w:pPr>
-            <w:r>
-              <w:t>Входной павильон - Проведение экскурсий по ботаническому саду</w:t>
+                <w:lang w:val="ru-RU"/>
+              </w:rPr>
+            </w:pPr>
+            <w:r>
+              <w:rPr>
+                <w:lang w:val="ru-RU"/>
+              </w:rPr>
+              <w:t>Субботник</w:t>
+            </w:r>
+            <w:r>
+              <w:rPr>
+                <w:lang w:val="ru-RU"/>
+              </w:rPr>
+              <w:t xml:space="preserve"> </w:t>
+            </w:r>
+            <w:r>
+              <w:rPr>
+                <w:lang w:val="ru-RU"/>
+              </w:rPr>
+              <w:t xml:space="preserve">TURAQTY JOL </w:t>
             </w:r>
           </w:p>
         </w:tc>
@@ -2507,15 +2878,40 @@
           <w:p>
             <w:pPr>
               <w:spacing w:line="240" w:lineRule="auto"/>
-            </w:pPr>
-            <w:r>
-              <w:rPr>
-                <w:lang w:val="ru-RU"/>
-              </w:rPr>
-              <w:t xml:space="preserve">Главный </w:t>
-            </w:r>
-            <w:r>
-              <w:t>Ботанический Сад Алматы</w:t>
+              <w:rPr>
+                <w:lang w:val="ru-RU"/>
+              </w:rPr>
+            </w:pPr>
+            <w:r>
+              <w:rPr>
+                <w:lang w:val="ru-RU"/>
+              </w:rPr>
+              <w:t>Акция по уборке территории после фестиваля от в</w:t>
+            </w:r>
+            <w:r>
+              <w:rPr>
+                <w:lang w:val="ru-RU"/>
+              </w:rPr>
+              <w:t>олонтер</w:t>
+            </w:r>
+            <w:r>
+              <w:rPr>
+                <w:lang w:val="ru-RU"/>
+              </w:rPr>
+              <w:t>ов</w:t>
+            </w:r>
+            <w:r>
+              <w:rPr>
+                <w:lang w:val="ru-RU"/>
+              </w:rPr>
+              <w:t xml:space="preserve"> </w:t>
+            </w:r>
+            <w:r>
+              <w:rPr>
+                <w:b/>
+                <w:lang w:val="ru-RU"/>
+              </w:rPr>
+              <w:t>Федерации клубов ЮНЕСКО</w:t>
             </w:r>
           </w:p>
         </w:tc>
@@ -2531,8 +2927,6 @@
           <w:szCs w:val="26"/>
         </w:rPr>
       </w:pPr>
-      <w:bookmarkStart w:id="2" w:name="_GoBack"/>
-      <w:bookmarkEnd w:id="2"/>
     </w:p>
     <w:tbl>
       <w:tblPr>
@@ -2583,8 +2977,8 @@
                 <w:szCs w:val="26"/>
               </w:rPr>
             </w:pPr>
-            <w:bookmarkStart w:id="3" w:name="_aoebbdv1z9p9" w:colFirst="0" w:colLast="0"/>
-            <w:bookmarkEnd w:id="3"/>
+            <w:bookmarkStart w:id="2" w:name="_aoebbdv1z9p9" w:colFirst="0" w:colLast="0"/>
+            <w:bookmarkEnd w:id="2"/>
             <w:r>
               <w:rPr>
                 <w:b/>
@@ -2624,20 +3018,23 @@
               </w:rPr>
             </w:pPr>
             <w:r>
-              <w:t>Викторина по технике безопасности</w:t>
-            </w:r>
-            <w:r>
-              <w:rPr>
-                <w:lang w:val="ru-RU"/>
-              </w:rPr>
-              <w:t xml:space="preserve"> </w:t>
-            </w:r>
-            <w:r>
-              <w:rPr>
-                <w:highlight w:val="yellow"/>
-                <w:lang w:val="ru-RU"/>
-              </w:rPr>
-              <w:t>от Караван Знаний</w:t>
+              <w:rPr>
+                <w:lang w:val="ru-RU"/>
+              </w:rPr>
+              <w:t>Викторина по технике безопасности проекта SAQ 2025</w:t>
+            </w:r>
+            <w:r>
+              <w:rPr>
+                <w:lang w:val="ru-RU"/>
+              </w:rPr>
+              <w:t xml:space="preserve"> от </w:t>
+            </w:r>
+            <w:r>
+              <w:rPr>
+                <w:b/>
+                <w:lang w:val="ru-RU"/>
+              </w:rPr>
+              <w:t>Национальной Волонтерской сети</w:t>
             </w:r>
           </w:p>
         </w:tc>
@@ -2695,20 +3092,43 @@
               <w:widowControl w:val="0"/>
               <w:rPr>
                 <w:rFonts w:ascii="Calibri" w:eastAsia="Calibri" w:hAnsi="Calibri" w:cs="Calibri"/>
-                <w:lang w:val="ru-RU"/>
+                <w:lang w:val="kk-KZ"/>
               </w:rPr>
             </w:pPr>
             <w:r>
               <w:t xml:space="preserve">Шоу-выступление флориста </w:t>
             </w:r>
-            <w:proofErr w:type="spellStart"/>
-            <w:r>
-              <w:t>Дмитри</w:t>
-            </w:r>
-            <w:proofErr w:type="spellEnd"/>
-            <w:r>
-              <w:rPr>
-                <w:lang w:val="ru-RU"/>
+            <w:r>
+              <w:rPr>
+                <w:b/>
+              </w:rPr>
+              <w:t>Гребенкин</w:t>
+            </w:r>
+            <w:r>
+              <w:rPr>
+                <w:b/>
+                <w:lang w:val="kk-KZ"/>
+              </w:rPr>
+              <w:t>а</w:t>
+            </w:r>
+            <w:r>
+              <w:rPr>
+                <w:b/>
+              </w:rPr>
+              <w:t xml:space="preserve"> </w:t>
+            </w:r>
+            <w:proofErr w:type="spellStart"/>
+            <w:r>
+              <w:rPr>
+                <w:b/>
+              </w:rPr>
+              <w:t>Димитри</w:t>
+            </w:r>
+            <w:proofErr w:type="spellEnd"/>
+            <w:r>
+              <w:rPr>
+                <w:b/>
+                <w:lang w:val="kk-KZ"/>
               </w:rPr>
               <w:t>я</w:t>
             </w:r>
@@ -2773,19 +3193,15 @@
             <w:r>
               <w:t xml:space="preserve">Приветственное слово от </w:t>
             </w:r>
-            <w:proofErr w:type="spellStart"/>
-            <w:r>
-              <w:t>Chevron</w:t>
-            </w:r>
-            <w:proofErr w:type="spellEnd"/>
-            <w:r>
-              <w:t xml:space="preserve"> </w:t>
-            </w:r>
-            <w:proofErr w:type="spellStart"/>
-            <w:r>
-              <w:t>Kazakhstan</w:t>
-            </w:r>
-            <w:proofErr w:type="spellEnd"/>
+            <w:r>
+              <w:t xml:space="preserve">представителя Евразийского подразделения компании </w:t>
+            </w:r>
+            <w:r>
+              <w:rPr>
+                <w:b/>
+              </w:rPr>
+              <w:t>«Шеврон»</w:t>
+            </w:r>
           </w:p>
         </w:tc>
         <w:tc>
@@ -2845,10 +3261,32 @@
               </w:rPr>
             </w:pPr>
             <w:r>
-              <w:t xml:space="preserve">Приветственное слово от </w:t>
-            </w:r>
-            <w:proofErr w:type="spellStart"/>
-            <w:r>
+              <w:t>Приветственное слово от</w:t>
+            </w:r>
+            <w:r>
+              <w:rPr>
+                <w:lang w:val="ru-RU"/>
+              </w:rPr>
+              <w:t xml:space="preserve"> </w:t>
+            </w:r>
+            <w:r>
+              <w:rPr>
+                <w:b/>
+                <w:lang w:val="ru-RU"/>
+              </w:rPr>
+              <w:t>ОФ</w:t>
+            </w:r>
+            <w:r>
+              <w:rPr>
+                <w:b/>
+              </w:rPr>
+              <w:t xml:space="preserve"> </w:t>
+            </w:r>
+            <w:proofErr w:type="spellStart"/>
+            <w:r>
+              <w:rPr>
+                <w:b/>
+              </w:rPr>
               <w:t>ITeachMe</w:t>
             </w:r>
             <w:proofErr w:type="spellEnd"/>
@@ -2908,10 +3346,33 @@
               <w:widowControl w:val="0"/>
               <w:rPr>
                 <w:rFonts w:ascii="Calibri" w:eastAsia="Calibri" w:hAnsi="Calibri" w:cs="Calibri"/>
-              </w:rPr>
-            </w:pPr>
-            <w:r>
-              <w:t>Приветственно слово от Ботанического Сада и презентация образовательных программ</w:t>
+                <w:lang w:val="ru-RU"/>
+              </w:rPr>
+            </w:pPr>
+            <w:r>
+              <w:t xml:space="preserve">Приветственно слово от </w:t>
+            </w:r>
+            <w:r>
+              <w:rPr>
+                <w:b/>
+                <w:lang w:val="ru-RU"/>
+              </w:rPr>
+              <w:t>Института Ботаники и Фитоинтродукции</w:t>
+            </w:r>
+            <w:r>
+              <w:t xml:space="preserve"> и презентация образовательных программ</w:t>
+            </w:r>
+            <w:r>
+              <w:rPr>
+                <w:lang w:val="ru-RU"/>
+              </w:rPr>
+              <w:t xml:space="preserve"> в ботсаду</w:t>
+            </w:r>
+            <w:r>
+              <w:rPr>
+                <w:lang w:val="ru-RU"/>
+              </w:rPr>
+              <w:t xml:space="preserve"> </w:t>
             </w:r>
           </w:p>
         </w:tc>
@@ -2992,14 +3453,23 @@
             </w:r>
             <w:proofErr w:type="spellStart"/>
             <w:r>
+              <w:rPr>
+                <w:b/>
+              </w:rPr>
               <w:t>Tabigat</w:t>
             </w:r>
             <w:proofErr w:type="spellEnd"/>
             <w:r>
-              <w:t xml:space="preserve"> </w:t>
-            </w:r>
-            <w:proofErr w:type="spellStart"/>
-            <w:r>
+              <w:rPr>
+                <w:b/>
+              </w:rPr>
+              <w:t xml:space="preserve"> </w:t>
+            </w:r>
+            <w:proofErr w:type="spellStart"/>
+            <w:r>
+              <w:rPr>
+                <w:b/>
+              </w:rPr>
               <w:t>Labs</w:t>
             </w:r>
             <w:proofErr w:type="spellEnd"/>
@@ -3074,10 +3544,16 @@
             </w:r>
             <w:proofErr w:type="spellStart"/>
             <w:r>
+              <w:rPr>
+                <w:b/>
+              </w:rPr>
               <w:t>Джепка</w:t>
             </w:r>
             <w:proofErr w:type="spellEnd"/>
             <w:r>
+              <w:rPr>
+                <w:b/>
+              </w:rPr>
               <w:t xml:space="preserve"> Богдан</w:t>
             </w:r>
           </w:p>
@@ -3139,7 +3615,39 @@
               </w:rPr>
             </w:pPr>
             <w:r>
-              <w:t>«Загрязнение окружающей среды и РСО» (раздельный сбор отходов), Валерия Фролова, Общественный фонд Greenup.kz (</w:t>
+              <w:t xml:space="preserve">«Загрязнение окружающей среды и </w:t>
+            </w:r>
+            <w:r>
+              <w:rPr>
+                <w:lang w:val="kk-KZ"/>
+              </w:rPr>
+              <w:t>р</w:t>
+            </w:r>
+            <w:proofErr w:type="spellStart"/>
+            <w:r>
+              <w:t>аздельный</w:t>
+            </w:r>
+            <w:proofErr w:type="spellEnd"/>
+            <w:r>
+              <w:t xml:space="preserve"> сбор отходов</w:t>
+            </w:r>
+            <w:r>
+              <w:rPr>
+                <w:lang w:val="ru-RU"/>
+              </w:rPr>
+              <w:t>»</w:t>
+            </w:r>
+            <w:r>
+              <w:t xml:space="preserve">, Валерия Фролова, </w:t>
+            </w:r>
+            <w:r>
+              <w:rPr>
+                <w:b/>
+              </w:rPr>
+              <w:t>Общественный фонд Greenup.kz</w:t>
+            </w:r>
+            <w:r>
+              <w:t xml:space="preserve"> (</w:t>
             </w:r>
             <w:proofErr w:type="spellStart"/>
             <w:r>
@@ -3205,10 +3713,14 @@
               <w:widowControl w:val="0"/>
               <w:rPr>
                 <w:rFonts w:ascii="Calibri" w:eastAsia="Calibri" w:hAnsi="Calibri" w:cs="Calibri"/>
-              </w:rPr>
-            </w:pPr>
-            <w:r>
-              <w:t xml:space="preserve">Инклюзия в действии: как технологии меняют мир - Дмитрий Пак и </w:t>
+                <w:lang w:val="ru-RU"/>
+              </w:rPr>
+            </w:pPr>
+            <w:r>
+              <w:t>И</w:t>
+            </w:r>
+            <w:r>
+              <w:t xml:space="preserve">нклюзия в действии: как технологии меняют мир - Дмитрий Пак и </w:t>
             </w:r>
             <w:proofErr w:type="spellStart"/>
             <w:r>
@@ -3221,6 +3733,21 @@
             <w:proofErr w:type="spellStart"/>
             <w:r>
               <w:t>Даурен</w:t>
+            </w:r>
+            <w:proofErr w:type="spellEnd"/>
+            <w:r>
+              <w:rPr>
+                <w:lang w:val="ru-RU"/>
+              </w:rPr>
+              <w:t xml:space="preserve">, </w:t>
+            </w:r>
+            <w:proofErr w:type="spellStart"/>
+            <w:r>
+              <w:rPr>
+                <w:b/>
+                <w:lang w:val="en-US"/>
+              </w:rPr>
+              <w:t>ITeachMe</w:t>
             </w:r>
             <w:proofErr w:type="spellEnd"/>
           </w:p>
@@ -3282,7 +3809,44 @@
               </w:rPr>
             </w:pPr>
             <w:r>
-              <w:t>Лекция "Красная Книга - сигнал бедствия из мира растений", Ситпаева Г.Т. ген директор Института Ботаники и Фитоинтродукции</w:t>
+              <w:t xml:space="preserve">Лекция "Красная Книга - сигнал бедствия из мира растений", </w:t>
+            </w:r>
+            <w:r>
+              <w:rPr>
+                <w:lang w:val="ru-RU"/>
+              </w:rPr>
+              <w:t xml:space="preserve">Гульнара </w:t>
+            </w:r>
+            <w:proofErr w:type="gramStart"/>
+            <w:r>
+              <w:t xml:space="preserve">Ситпаева </w:t>
+            </w:r>
+            <w:r>
+              <w:rPr>
+                <w:lang w:val="ru-RU"/>
+              </w:rPr>
+              <w:t>,</w:t>
+            </w:r>
+            <w:proofErr w:type="gramEnd"/>
+            <w:r>
+              <w:t xml:space="preserve"> ген</w:t>
+            </w:r>
+            <w:proofErr w:type="spellStart"/>
+            <w:r>
+              <w:rPr>
+                <w:lang w:val="ru-RU"/>
+              </w:rPr>
+              <w:t>еральный</w:t>
+            </w:r>
+            <w:proofErr w:type="spellEnd"/>
+            <w:r>
+              <w:t xml:space="preserve"> директор </w:t>
+            </w:r>
+            <w:r>
+              <w:rPr>
+                <w:b/>
+              </w:rPr>
+              <w:t>Института Ботаники и Фитоинтродукции</w:t>
             </w:r>
           </w:p>
         </w:tc>
@@ -3361,8 +3925,17 @@
             <w:r>
               <w:t xml:space="preserve">, </w:t>
             </w:r>
-            <w:proofErr w:type="spellStart"/>
-            <w:r>
+            <w:r>
+              <w:rPr>
+                <w:lang w:val="ru-RU"/>
+              </w:rPr>
+              <w:t xml:space="preserve">фонд </w:t>
+            </w:r>
+            <w:proofErr w:type="spellStart"/>
+            <w:r>
+              <w:rPr>
+                <w:b/>
+              </w:rPr>
               <w:t>МамаПро</w:t>
             </w:r>
             <w:proofErr w:type="spellEnd"/>
@@ -3429,6 +4002,9 @@
             </w:r>
             <w:proofErr w:type="spellStart"/>
             <w:r>
+              <w:rPr>
+                <w:b/>
+              </w:rPr>
               <w:t>ARTиШОК</w:t>
             </w:r>
             <w:proofErr w:type="spellEnd"/>
@@ -3498,16 +4074,99 @@
               <w:rPr>
                 <w:lang w:val="ru-RU"/>
               </w:rPr>
-              <w:t xml:space="preserve"> режиссера Канат </w:t>
-            </w:r>
-            <w:proofErr w:type="spellStart"/>
-            <w:r>
-              <w:rPr>
-                <w:lang w:val="ru-RU"/>
-              </w:rPr>
-              <w:t>Бейсикеева</w:t>
-            </w:r>
-            <w:proofErr w:type="spellEnd"/>
+              <w:t xml:space="preserve"> режиссера </w:t>
+            </w:r>
+            <w:r>
+              <w:rPr>
+                <w:b/>
+                <w:lang w:val="ru-RU"/>
+              </w:rPr>
+              <w:t>Канат</w:t>
+            </w:r>
+            <w:r>
+              <w:rPr>
+                <w:b/>
+                <w:lang w:val="ru-RU"/>
+              </w:rPr>
+              <w:t>а</w:t>
+            </w:r>
+            <w:r>
+              <w:rPr>
+                <w:b/>
+                <w:lang w:val="ru-RU"/>
+              </w:rPr>
+              <w:t xml:space="preserve"> </w:t>
+            </w:r>
+            <w:proofErr w:type="spellStart"/>
+            <w:r>
+              <w:rPr>
+                <w:b/>
+                <w:lang w:val="ru-RU"/>
+              </w:rPr>
+              <w:t>Бейс</w:t>
+            </w:r>
+            <w:r>
+              <w:rPr>
+                <w:b/>
+                <w:lang w:val="ru-RU"/>
+              </w:rPr>
+              <w:t>е</w:t>
+            </w:r>
+            <w:r>
+              <w:rPr>
+                <w:b/>
+                <w:lang w:val="ru-RU"/>
+              </w:rPr>
+              <w:t>кеева</w:t>
+            </w:r>
+            <w:proofErr w:type="spellEnd"/>
+            <w:r>
+              <w:rPr>
+                <w:lang w:val="ru-RU"/>
+              </w:rPr>
+              <w:t xml:space="preserve"> </w:t>
+            </w:r>
+            <w:r>
+              <w:rPr>
+                <w:lang w:val="kk-KZ"/>
+              </w:rPr>
+              <w:t xml:space="preserve">и </w:t>
+            </w:r>
+            <w:r>
+              <w:rPr>
+                <w:b/>
+                <w:lang w:val="en-US"/>
+              </w:rPr>
+              <w:t>Almaty</w:t>
+            </w:r>
+            <w:r>
+              <w:rPr>
+                <w:b/>
+                <w:lang w:val="ru-RU"/>
+              </w:rPr>
+              <w:t xml:space="preserve"> </w:t>
+            </w:r>
+            <w:r>
+              <w:rPr>
+                <w:b/>
+                <w:lang w:val="en-US"/>
+              </w:rPr>
+              <w:t>Air</w:t>
+            </w:r>
+            <w:r>
+              <w:rPr>
+                <w:b/>
+                <w:lang w:val="ru-RU"/>
+              </w:rPr>
+              <w:t xml:space="preserve"> </w:t>
+            </w:r>
+            <w:r>
+              <w:rPr>
+                <w:b/>
+                <w:lang w:val="en-US"/>
+              </w:rPr>
+              <w:t>Initiative</w:t>
+            </w:r>
           </w:p>
         </w:tc>
         <w:tc>
@@ -3545,25 +4204,13 @@
     <w:p>
       <w:pPr>
         <w:spacing w:before="240" w:after="240"/>
-      </w:pPr>
-    </w:p>
-    <w:p>
-      <w:pPr>
-        <w:spacing w:before="240" w:after="240"/>
         <w:rPr>
           <w:b/>
         </w:rPr>
       </w:pPr>
+      <w:bookmarkStart w:id="3" w:name="_GoBack"/>
+      <w:bookmarkEnd w:id="3"/>
     </w:p>
-    <w:p>
-      <w:pPr>
-        <w:spacing w:before="240" w:after="240"/>
-        <w:rPr>
-          <w:b/>
-        </w:rPr>
-      </w:pPr>
-    </w:p>
-    <w:p/>
     <w:sectPr>
       <w:pgSz w:w="11909" w:h="16834"/>
       <w:pgMar w:top="1440" w:right="1440" w:bottom="1440" w:left="1440" w:header="720" w:footer="720" w:gutter="0"/>
@@ -4508,7 +5155,7 @@
 </file>
 
 <file path=customXml/itemProps1.xml><?xml version="1.0" encoding="utf-8"?>
-<ds:datastoreItem xmlns:ds="http://schemas.openxmlformats.org/officeDocument/2006/customXml" ds:itemID="{BE88DE37-E048-4219-BF01-00A517E3B537}">
+<ds:datastoreItem xmlns:ds="http://schemas.openxmlformats.org/officeDocument/2006/customXml" ds:itemID="{45DAF22B-62CE-4AF4-8EC7-E464AE4ED262}">
   <ds:schemaRefs>
     <ds:schemaRef ds:uri="http://schemas.openxmlformats.org/officeDocument/2006/bibliography"/>
   </ds:schemaRefs>

</xml_diff>

<commit_message>
feat: update program file with latest detailed version 2025 (3)
</commit_message>
<xml_diff>
--- a/public/program.docx
+++ b/public/program.docx
@@ -1,6 +1,6 @@
 
 <file path=word/document.xml><?xml version="1.0" encoding="utf-8"?>
-<w:document xmlns:wpc="http://schemas.microsoft.com/office/word/2010/wordprocessingCanvas" xmlns:cx="http://schemas.microsoft.com/office/drawing/2014/chartex" xmlns:cx1="http://schemas.microsoft.com/office/drawing/2015/9/8/chartex" xmlns:cx2="http://schemas.microsoft.com/office/drawing/2015/10/21/chartex" xmlns:cx3="http://schemas.microsoft.com/office/drawing/2016/5/9/chartex" xmlns:cx4="http://schemas.microsoft.com/office/drawing/2016/5/10/chartex" xmlns:cx5="http://schemas.microsoft.com/office/drawing/2016/5/11/chartex" xmlns:cx6="http://schemas.microsoft.com/office/drawing/2016/5/12/chartex" xmlns:cx7="http://schemas.microsoft.com/office/drawing/2016/5/13/chartex" xmlns:cx8="http://schemas.microsoft.com/office/drawing/2016/5/14/chartex" xmlns:mc="http://schemas.openxmlformats.org/markup-compatibility/2006" xmlns:aink="http://schemas.microsoft.com/office/drawing/2016/ink" xmlns:am3d="http://schemas.microsoft.com/office/drawing/2017/model3d" xmlns:o="urn:schemas-microsoft-com:office:office" xmlns:r="http://schemas.openxmlformats.org/officeDocument/2006/relationships" xmlns:m="http://schemas.openxmlformats.org/officeDocument/2006/math" xmlns:v="urn:schemas-microsoft-com:vml" xmlns:wp14="http://schemas.microsoft.com/office/word/2010/wordprocessingDrawing" xmlns:wp="http://schemas.openxmlformats.org/drawingml/2006/wordprocessingDrawing" xmlns:w10="urn:schemas-microsoft-com:office:word" xmlns:w="http://schemas.openxmlformats.org/wordprocessingml/2006/main" xmlns:w14="http://schemas.microsoft.com/office/word/2010/wordml" xmlns:w15="http://schemas.microsoft.com/office/word/2012/wordml" xmlns:w16cid="http://schemas.microsoft.com/office/word/2016/wordml/cid" xmlns:w16se="http://schemas.microsoft.com/office/word/2015/wordml/symex" xmlns:wpg="http://schemas.microsoft.com/office/word/2010/wordprocessingGroup" xmlns:wpi="http://schemas.microsoft.com/office/word/2010/wordprocessingInk" xmlns:wne="http://schemas.microsoft.com/office/word/2006/wordml" xmlns:wps="http://schemas.microsoft.com/office/word/2010/wordprocessingShape" mc:Ignorable="w14 w15 w16se w16cid wp14">
+<w:document xmlns:w="http://schemas.openxmlformats.org/wordprocessingml/2006/main">
   <w:body>
     <w:p>
       <w:pPr>
@@ -64,7 +64,7 @@
           <w:sz w:val="32"/>
           <w:szCs w:val="32"/>
         </w:rPr>
-        <w:t>программа</w:t>
+        <w:t>бағдарлама</w:t>
       </w:r>
       <w:r>
         <w:rPr>
@@ -73,7 +73,7 @@
           <w:szCs w:val="32"/>
           <w:lang w:val="ru-RU"/>
         </w:rPr>
-        <w:t xml:space="preserve"> фестиваля</w:t>
+        <w:t xml:space="preserve"> фестивальдің</w:t>
       </w:r>
     </w:p>
     <w:p>
@@ -90,10 +90,10 @@
         <w:rPr>
           <w:b/>
         </w:rPr>
-        <w:t>Дата проведения:</w:t>
+        <w:t>Өткізу күні:</w:t>
       </w:r>
       <w:r>
-        <w:t xml:space="preserve"> 15 августа 2025 года</w:t>
+        <w:t xml:space="preserve"> 2025 жылғы 15 тамыз</w:t>
       </w:r>
       <w:r>
         <w:br/>
@@ -158,7 +158,7 @@
                 <w:sz w:val="26"/>
                 <w:szCs w:val="26"/>
               </w:rPr>
-              <w:t>Программа мастер-классов</w:t>
+              <w:t>Мастер-класстар бағдарламасы</w:t>
             </w:r>
           </w:p>
           <w:p>
@@ -218,7 +218,7 @@
               <w:rPr>
                 <w:b/>
               </w:rPr>
-              <w:t>Место проведения</w:t>
+              <w:t>Өткізілетін орны</w:t>
             </w:r>
           </w:p>
         </w:tc>
@@ -248,7 +248,7 @@
                 <w:b/>
                 <w:lang w:val="ru-RU"/>
               </w:rPr>
-              <w:t xml:space="preserve">Описание и </w:t>
+              <w:t xml:space="preserve">Сипаттамасы және </w:t>
             </w:r>
             <w:proofErr w:type="spellStart"/>
             <w:r>
@@ -299,7 +299,7 @@
             </w:r>
             <w:proofErr w:type="gramStart"/>
             <w:r>
-              <w:t>зона</w:t>
+              <w:t>аймақ</w:t>
             </w:r>
             <w:r>
               <w:rPr>
@@ -314,14 +314,14 @@
               <w:rPr>
                 <w:lang w:val="ru-RU"/>
               </w:rPr>
-              <w:t>Инклюзивное</w:t>
+              <w:t>Инклюзивті</w:t>
             </w:r>
             <w:proofErr w:type="gramEnd"/>
             <w:r>
               <w:rPr>
                 <w:lang w:val="ru-RU"/>
               </w:rPr>
-              <w:t xml:space="preserve"> общество </w:t>
+              <w:t xml:space="preserve"> қоғам </w:t>
             </w:r>
           </w:p>
         </w:tc>
@@ -354,13 +354,13 @@
               <w:rPr>
                 <w:lang w:val="kk-KZ"/>
               </w:rPr>
-              <w:t xml:space="preserve">ктивности </w:t>
-            </w:r>
-            <w:r>
-              <w:rPr>
-                <w:b/>
-              </w:rPr>
-              <w:t>ОФ “</w:t>
+              <w:t xml:space="preserve">белсенділік </w:t>
+            </w:r>
+            <w:r>
+              <w:rPr>
+                <w:b/>
+              </w:rPr>
+              <w:t>ҚФ "</w:t>
             </w:r>
             <w:proofErr w:type="spellStart"/>
             <w:proofErr w:type="gramStart"/>
@@ -397,7 +397,7 @@
               <w:rPr>
                 <w:lang w:val="ru-RU"/>
               </w:rPr>
-              <w:t xml:space="preserve"> равные возможности: создай, играй, вдохновляй</w:t>
+              <w:t xml:space="preserve"> тең мүмкіндіктер: жасаңыз, ойнаңыз, шабыттандырыңыз</w:t>
             </w:r>
             <w:r>
               <w:rPr>
@@ -409,7 +409,7 @@
               <w:rPr>
                 <w:lang w:val="ru-RU"/>
               </w:rPr>
-              <w:t xml:space="preserve">советы </w:t>
+              <w:t xml:space="preserve">кеңестер </w:t>
             </w:r>
             <w:proofErr w:type="spellStart"/>
             <w:r>
@@ -429,7 +429,7 @@
               <w:rPr>
                 <w:lang w:val="ru-RU"/>
               </w:rPr>
-              <w:t xml:space="preserve"> фестиваля</w:t>
+              <w:t xml:space="preserve"> фестивальдің</w:t>
             </w:r>
             <w:r>
               <w:rPr>
@@ -441,27 +441,27 @@
               <w:rPr>
                 <w:lang w:val="ru-RU"/>
               </w:rPr>
-              <w:t xml:space="preserve">простым языком </w:t>
-            </w:r>
-            <w:r>
-              <w:rPr>
-                <w:lang w:val="ru-RU"/>
-              </w:rPr>
-              <w:t xml:space="preserve">про инклюзию и </w:t>
-            </w:r>
-            <w:proofErr w:type="spellStart"/>
-            <w:r>
-              <w:rPr>
-                <w:lang w:val="ru-RU"/>
-              </w:rPr>
-              <w:t>крафтовые</w:t>
-            </w:r>
-            <w:proofErr w:type="spellEnd"/>
-            <w:r>
-              <w:rPr>
-                <w:lang w:val="ru-RU"/>
-              </w:rPr>
-              <w:t xml:space="preserve"> инклюзивные игры</w:t>
+              <w:t xml:space="preserve">қарапайым тілде </w:t>
+            </w:r>
+            <w:r>
+              <w:rPr>
+                <w:lang w:val="ru-RU"/>
+              </w:rPr>
+              <w:t xml:space="preserve">инклюзия және интеграция туралы </w:t>
+            </w:r>
+            <w:proofErr w:type="spellStart"/>
+            <w:r>
+              <w:rPr>
+                <w:lang w:val="ru-RU"/>
+              </w:rPr>
+              <w:t>қолөнер бұйымдары</w:t>
+            </w:r>
+            <w:proofErr w:type="spellEnd"/>
+            <w:r>
+              <w:rPr>
+                <w:lang w:val="ru-RU"/>
+              </w:rPr>
+              <w:t xml:space="preserve"> инклюзивті ойындар</w:t>
             </w:r>
             <w:r>
               <w:rPr>
@@ -498,13 +498,13 @@
               </w:rPr>
             </w:pPr>
             <w:r>
-              <w:t>2 зона</w:t>
-            </w:r>
-            <w:r>
-              <w:rPr>
-                <w:lang w:val="ru-RU"/>
-              </w:rPr>
-              <w:t>: Эко-Город</w:t>
+              <w:t>2 аймақ</w:t>
+            </w:r>
+            <w:r>
+              <w:rPr>
+                <w:lang w:val="ru-RU"/>
+              </w:rPr>
+              <w:t>: Эко-қала</w:t>
             </w:r>
           </w:p>
         </w:tc>
@@ -531,13 +531,13 @@
               <w:rPr>
                 <w:lang w:val="ru-RU"/>
               </w:rPr>
-              <w:t xml:space="preserve">Настольная игра "Жара в городе" </w:t>
-            </w:r>
-            <w:r>
-              <w:rPr>
-                <w:lang w:val="ru-RU"/>
-              </w:rPr>
-              <w:t xml:space="preserve">от </w:t>
+              <w:t xml:space="preserve">"Қаладағы аптап ыстық" үстел ойыны </w:t>
+            </w:r>
+            <w:r>
+              <w:rPr>
+                <w:lang w:val="ru-RU"/>
+              </w:rPr>
+              <w:t xml:space="preserve">бастап </w:t>
             </w:r>
             <w:proofErr w:type="spellStart"/>
             <w:r>
@@ -578,7 +578,7 @@
                 <w:b/>
                 <w:lang w:val="ru-RU"/>
               </w:rPr>
-              <w:t xml:space="preserve">Института Ботаники и Фитоинтродукции, </w:t>
+              <w:t xml:space="preserve">Ботаника және фитоинтродукция институтының, </w:t>
             </w:r>
             <w:proofErr w:type="spellStart"/>
             <w:r>
@@ -642,7 +642,7 @@
                 <w:b/>
                 <w:lang w:val="ru-RU"/>
               </w:rPr>
-              <w:t xml:space="preserve"> и </w:t>
+              <w:t xml:space="preserve"> және </w:t>
             </w:r>
             <w:proofErr w:type="spellStart"/>
             <w:r>
@@ -728,7 +728,7 @@
               </w:rPr>
             </w:pPr>
             <w:r>
-              <w:t>3 зона</w:t>
+              <w:t>3 аймақ</w:t>
             </w:r>
             <w:r>
               <w:rPr>
@@ -743,19 +743,19 @@
               <w:rPr>
                 <w:lang w:val="ru-RU"/>
               </w:rPr>
-              <w:t>логи</w:t>
-            </w:r>
-            <w:r>
-              <w:rPr>
-                <w:lang w:val="ru-RU"/>
-              </w:rPr>
-              <w:t xml:space="preserve">чный </w:t>
-            </w:r>
-            <w:r>
-              <w:rPr>
-                <w:lang w:val="ru-RU"/>
-              </w:rPr>
-              <w:t>стиль жизни</w:t>
+              <w:t>журналдар</w:t>
+            </w:r>
+            <w:r>
+              <w:rPr>
+                <w:lang w:val="ru-RU"/>
+              </w:rPr>
+              <w:t xml:space="preserve">жеке </w:t>
+            </w:r>
+            <w:r>
+              <w:rPr>
+                <w:lang w:val="ru-RU"/>
+              </w:rPr>
+              <w:t>өмір салты</w:t>
             </w:r>
           </w:p>
         </w:tc>
@@ -776,7 +776,7 @@
               <w:spacing w:line="240" w:lineRule="auto"/>
             </w:pPr>
             <w:r>
-              <w:t xml:space="preserve">- Интерактивный мастер-класс от </w:t>
+              <w:t xml:space="preserve">- Интерактивті мастер-класс </w:t>
             </w:r>
             <w:proofErr w:type="spellStart"/>
             <w:r>
@@ -801,7 +801,7 @@
             </w:r>
             <w:proofErr w:type="spellEnd"/>
             <w:r>
-              <w:t xml:space="preserve"> по сортировке отходов</w:t>
+              <w:t xml:space="preserve"> қалдықтарды сұрыптау бойынша</w:t>
             </w:r>
           </w:p>
           <w:p>
@@ -818,16 +818,16 @@
               <w:rPr>
                 <w:lang w:val="ru-RU"/>
               </w:rPr>
-              <w:t xml:space="preserve">Участники клуба </w:t>
-            </w:r>
-            <w:r>
-              <w:t>"Книги и краски" - изучаем и рисуем</w:t>
-            </w:r>
-            <w:r>
-              <w:rPr>
-                <w:lang w:val="ru-RU"/>
-              </w:rPr>
-              <w:t xml:space="preserve"> с </w:t>
+              <w:t xml:space="preserve">Клуб қатысушылары </w:t>
+            </w:r>
+            <w:r>
+              <w:t>"Кітаптар мен бояулар" - оқимыз және сурет саламыз</w:t>
+            </w:r>
+            <w:r>
+              <w:rPr>
+                <w:lang w:val="ru-RU"/>
+              </w:rPr>
+              <w:t xml:space="preserve"> бастап </w:t>
             </w:r>
             <w:r>
               <w:rPr>
@@ -849,7 +849,7 @@
                 <w:b/>
                 <w:lang w:val="kk-KZ"/>
               </w:rPr>
-              <w:t>Культура</w:t>
+              <w:t>Мәдениет</w:t>
             </w:r>
             <w:r>
               <w:rPr>
@@ -868,23 +868,23 @@
               <w:rPr>
                 <w:lang w:val="ru-RU"/>
               </w:rPr>
-              <w:t xml:space="preserve"> книгообмен от</w:t>
-            </w:r>
-            <w:r>
-              <w:t xml:space="preserve"> </w:t>
-            </w:r>
-            <w:r>
-              <w:rPr>
-                <w:b/>
-                <w:lang w:val="ru-RU"/>
-              </w:rPr>
-              <w:t>ОФ КОМУНИТИПЛЮС</w:t>
+              <w:t xml:space="preserve"> кітап алмасу</w:t>
+            </w:r>
+            <w:r>
+              <w:t xml:space="preserve"> </w:t>
+            </w:r>
+            <w:r>
+              <w:rPr>
+                <w:b/>
+                <w:lang w:val="ru-RU"/>
+              </w:rPr>
+              <w:t>КОМУНИТИПЛУС ҚҚ</w:t>
             </w:r>
             <w:r>
               <w:rPr>
                 <w:lang w:val="kk-KZ"/>
               </w:rPr>
-              <w:t>, рис</w:t>
+              <w:t>, күріш</w:t>
             </w:r>
             <w:r>
               <w:rPr>
@@ -896,14 +896,14 @@
               <w:rPr>
                 <w:lang w:val="kk-KZ"/>
               </w:rPr>
-              <w:t xml:space="preserve">нки природы от  </w:t>
-            </w:r>
-            <w:r>
-              <w:rPr>
-                <w:b/>
-                <w:lang w:val="ru-RU"/>
-              </w:rPr>
-              <w:t xml:space="preserve">ОФ </w:t>
+              <w:t xml:space="preserve">табиғат ҒЗИ бастап  </w:t>
+            </w:r>
+            <w:r>
+              <w:rPr>
+                <w:b/>
+                <w:lang w:val="ru-RU"/>
+              </w:rPr>
+              <w:t xml:space="preserve">БФ </w:t>
             </w:r>
             <w:proofErr w:type="spellStart"/>
             <w:r>
@@ -933,7 +933,7 @@
               <w:rPr>
                 <w:lang w:val="ru-RU"/>
               </w:rPr>
-              <w:t xml:space="preserve"> и </w:t>
+              <w:t xml:space="preserve"> және </w:t>
             </w:r>
             <w:r>
               <w:rPr>
@@ -945,20 +945,20 @@
               <w:rPr>
                 <w:lang w:val="ru-RU"/>
               </w:rPr>
-              <w:t>и</w:t>
-            </w:r>
-            <w:r>
-              <w:rPr>
-                <w:lang w:val="ru-RU"/>
-              </w:rPr>
-              <w:t xml:space="preserve"> каллиграфии </w:t>
-            </w:r>
-            <w:r>
-              <w:rPr>
-                <w:b/>
-                <w:lang w:val="ru-RU"/>
-              </w:rPr>
-              <w:t>Елены Шахматовой</w:t>
+              <w:t>және</w:t>
+            </w:r>
+            <w:r>
+              <w:rPr>
+                <w:lang w:val="ru-RU"/>
+              </w:rPr>
+              <w:t xml:space="preserve"> каллиграфия </w:t>
+            </w:r>
+            <w:r>
+              <w:rPr>
+                <w:b/>
+                <w:lang w:val="ru-RU"/>
+              </w:rPr>
+              <w:t>Елена Шахматованың</w:t>
             </w:r>
           </w:p>
           <w:p>
@@ -966,13 +966,13 @@
               <w:spacing w:line="240" w:lineRule="auto"/>
             </w:pPr>
             <w:r>
-              <w:t xml:space="preserve">- мастер-класс по изготовлению домиков и поилок для насекомых </w:t>
-            </w:r>
-            <w:r>
-              <w:rPr>
-                <w:lang w:val="ru-RU"/>
-              </w:rPr>
-              <w:t xml:space="preserve">от </w:t>
+              <w:t xml:space="preserve">- жәндіктерге арналған үйлер мен ауыз су ыдыстарын жасау бойынша мастер-класс </w:t>
+            </w:r>
+            <w:r>
+              <w:rPr>
+                <w:lang w:val="ru-RU"/>
+              </w:rPr>
+              <w:t xml:space="preserve">бастап </w:t>
             </w:r>
             <w:r>
               <w:rPr>
@@ -991,7 +991,7 @@
               <w:rPr>
                 <w:b/>
               </w:rPr>
-              <w:t xml:space="preserve"> Зеленых Рейнджер</w:t>
+              <w:t xml:space="preserve"> Жасыл Рейнджер</w:t>
             </w:r>
             <w:proofErr w:type="spellStart"/>
             <w:r>
@@ -1011,13 +1011,13 @@
               <w:spacing w:line="240" w:lineRule="auto"/>
             </w:pPr>
             <w:r>
-              <w:t xml:space="preserve">- Выставка коллекции шишек от </w:t>
-            </w:r>
-            <w:r>
-              <w:rPr>
-                <w:b/>
-              </w:rPr>
-              <w:t>Института Ботаники и Фитоинтродукции</w:t>
+              <w:t xml:space="preserve">- Қарағайлар топтамасының көрмесі </w:t>
+            </w:r>
+            <w:r>
+              <w:rPr>
+                <w:b/>
+              </w:rPr>
+              <w:t>Ботаника және фитоинтродукция институтының</w:t>
             </w:r>
           </w:p>
         </w:tc>
@@ -1052,7 +1052,7 @@
             </w:r>
             <w:proofErr w:type="gramStart"/>
             <w:r>
-              <w:t xml:space="preserve">зона </w:t>
+              <w:t xml:space="preserve">аймақ </w:t>
             </w:r>
             <w:r>
               <w:rPr>
@@ -1092,7 +1092,7 @@
               <w:rPr>
                 <w:lang w:val="ru-RU"/>
               </w:rPr>
-              <w:t xml:space="preserve">Создаем цветы в стиле </w:t>
+              <w:t xml:space="preserve">Стильде гүлдер жасаймыз </w:t>
             </w:r>
             <w:r>
               <w:t>оригами</w:t>
@@ -1107,13 +1107,13 @@
               <w:rPr>
                 <w:lang w:val="ru-RU"/>
               </w:rPr>
-              <w:t xml:space="preserve">в рамках образовательной </w:t>
-            </w:r>
-            <w:r>
-              <w:rPr>
-                <w:lang w:val="ru-RU"/>
-              </w:rPr>
-              <w:t>программы «Знать, чтобы любить» Института Ботаника и Фитоинтродукции</w:t>
+              <w:t xml:space="preserve">білім беру бағдарламасы шеңберінде </w:t>
+            </w:r>
+            <w:r>
+              <w:rPr>
+                <w:lang w:val="ru-RU"/>
+              </w:rPr>
+              <w:t>Ботаника және фитоинтродукция институтының "Сүюді білу" бағдарламалары</w:t>
             </w:r>
           </w:p>
           <w:p>
@@ -1130,27 +1130,27 @@
               <w:rPr>
                 <w:lang w:val="ru-RU"/>
               </w:rPr>
-              <w:t xml:space="preserve">Создаем цветочную композицию из цветов ботсада </w:t>
-            </w:r>
-            <w:r>
-              <w:rPr>
-                <w:lang w:val="ru-RU"/>
-              </w:rPr>
-              <w:t xml:space="preserve">от </w:t>
-            </w:r>
-            <w:r>
-              <w:rPr>
-                <w:b/>
-                <w:lang w:val="ru-RU"/>
-              </w:rPr>
-              <w:t>флориста Яны</w:t>
-            </w:r>
-            <w:r>
-              <w:rPr>
-                <w:b/>
-                <w:lang w:val="ru-RU"/>
-              </w:rPr>
-              <w:t xml:space="preserve"> Прокудиной</w:t>
+              <w:t xml:space="preserve">Ботаникалық бақтың гүлдерінен гүл композициясын жасаймыз </w:t>
+            </w:r>
+            <w:r>
+              <w:rPr>
+                <w:lang w:val="ru-RU"/>
+              </w:rPr>
+              <w:t xml:space="preserve">бастап </w:t>
+            </w:r>
+            <w:r>
+              <w:rPr>
+                <w:b/>
+                <w:lang w:val="ru-RU"/>
+              </w:rPr>
+              <w:t>гүл өсіруші Яна</w:t>
+            </w:r>
+            <w:r>
+              <w:rPr>
+                <w:b/>
+                <w:lang w:val="ru-RU"/>
+              </w:rPr>
+              <w:t xml:space="preserve"> Прокудинамен</w:t>
             </w:r>
           </w:p>
         </w:tc>
@@ -1182,7 +1182,7 @@
               </w:rPr>
             </w:pPr>
             <w:r>
-              <w:t>5 зона</w:t>
+              <w:t>5 аймақ</w:t>
             </w:r>
             <w:r>
               <w:rPr>
@@ -1197,7 +1197,7 @@
               <w:rPr>
                 <w:lang w:val="ru-RU"/>
               </w:rPr>
-              <w:t xml:space="preserve"> и робототехника</w:t>
+              <w:t xml:space="preserve"> және робототехника</w:t>
             </w:r>
           </w:p>
         </w:tc>
@@ -1230,7 +1230,7 @@
               <w:rPr>
                 <w:lang w:val="ru-RU"/>
               </w:rPr>
-              <w:t>Мастер-класс "Замкнутая экосистема"</w:t>
+              <w:t>"Тұйықталған экожүйе" мастер-классы</w:t>
             </w:r>
             <w:r>
               <w:rPr>
@@ -1243,7 +1243,7 @@
               <w:rPr>
                 <w:lang w:val="ru-RU"/>
               </w:rPr>
-              <w:t xml:space="preserve">от  </w:t>
+              <w:t xml:space="preserve">бастап  </w:t>
             </w:r>
             <w:proofErr w:type="spellStart"/>
             <w:r>
@@ -1289,7 +1289,7 @@
               <w:rPr>
                 <w:lang w:val="ru-RU"/>
               </w:rPr>
-              <w:t>Мастер класс по робототехнике от</w:t>
+              <w:t>Робототехника бойынша мастер-класс бастап</w:t>
             </w:r>
             <w:r>
               <w:t xml:space="preserve"> </w:t>
@@ -1341,31 +1341,31 @@
               <w:rPr>
                 <w:lang w:val="ru-RU"/>
               </w:rPr>
-              <w:t>Мастер</w:t>
-            </w:r>
-            <w:r>
-              <w:rPr>
-                <w:lang w:val="ru-RU"/>
-              </w:rPr>
-              <w:t xml:space="preserve"> </w:t>
-            </w:r>
-            <w:r>
-              <w:rPr>
-                <w:lang w:val="ru-RU"/>
-              </w:rPr>
-              <w:t>классы</w:t>
-            </w:r>
-            <w:r>
-              <w:rPr>
-                <w:lang w:val="ru-RU"/>
-              </w:rPr>
-              <w:t xml:space="preserve"> </w:t>
-            </w:r>
-            <w:r>
-              <w:rPr>
-                <w:lang w:val="ru-RU"/>
-              </w:rPr>
-              <w:t>от</w:t>
+              <w:t>Шебер</w:t>
+            </w:r>
+            <w:r>
+              <w:rPr>
+                <w:lang w:val="ru-RU"/>
+              </w:rPr>
+              <w:t xml:space="preserve"> </w:t>
+            </w:r>
+            <w:r>
+              <w:rPr>
+                <w:lang w:val="ru-RU"/>
+              </w:rPr>
+              <w:t>сыныптар</w:t>
+            </w:r>
+            <w:r>
+              <w:rPr>
+                <w:lang w:val="ru-RU"/>
+              </w:rPr>
+              <w:t xml:space="preserve"> </w:t>
+            </w:r>
+            <w:r>
+              <w:rPr>
+                <w:lang w:val="ru-RU"/>
+              </w:rPr>
+              <w:t>бастап</w:t>
             </w:r>
             <w:r>
               <w:rPr>
@@ -1424,7 +1424,7 @@
               <w:rPr>
                 <w:lang w:val="ru-RU"/>
               </w:rPr>
-              <w:t>Умный цветочный горшок</w:t>
+              <w:t>Ақылды гүл құмыра</w:t>
             </w:r>
             <w:r>
               <w:rPr>
@@ -1443,7 +1443,7 @@
               <w:rPr>
                 <w:lang w:val="ru-RU"/>
               </w:rPr>
-              <w:t>Монитор качества воздуха</w:t>
+              <w:t>Ауа сапасының мониторы</w:t>
             </w:r>
             <w:r>
               <w:rPr>
@@ -1455,7 +1455,7 @@
               <w:rPr>
                 <w:lang w:val="ru-RU"/>
               </w:rPr>
-              <w:t>Извлечение ДНК</w:t>
+              <w:t>ДНҚ-ны бөліп алу</w:t>
             </w:r>
             <w:r>
               <w:rPr>
@@ -1467,7 +1467,7 @@
               <w:rPr>
                 <w:lang w:val="ru-RU"/>
               </w:rPr>
-              <w:t xml:space="preserve">Натуральные </w:t>
+              <w:t xml:space="preserve">Табиғи </w:t>
             </w:r>
             <w:proofErr w:type="spellStart"/>
             <w:r>
@@ -1481,7 +1481,7 @@
               <w:rPr>
                 <w:lang w:val="ru-RU"/>
               </w:rPr>
-              <w:t xml:space="preserve"> индикаторы</w:t>
+              <w:t xml:space="preserve"> индикаторлар</w:t>
             </w:r>
             <w:r>
               <w:rPr>
@@ -1494,14 +1494,14 @@
               <w:rPr>
                 <w:lang w:val="ru-RU"/>
               </w:rPr>
-              <w:t>бомбочка</w:t>
-            </w:r>
-            <w:proofErr w:type="spellEnd"/>
-            <w:r>
-              <w:rPr>
-                <w:lang w:val="ru-RU"/>
-              </w:rPr>
-              <w:t xml:space="preserve"> для ванны</w:t>
+              <w:t>бомба</w:t>
+            </w:r>
+            <w:proofErr w:type="spellEnd"/>
+            <w:r>
+              <w:rPr>
+                <w:lang w:val="ru-RU"/>
+              </w:rPr>
+              <w:t xml:space="preserve"> ваннаға арналған</w:t>
             </w:r>
             <w:r>
               <w:rPr>
@@ -1520,7 +1520,7 @@
               <w:rPr>
                 <w:lang w:val="ru-RU"/>
               </w:rPr>
-              <w:t>00  Эксперименты</w:t>
+              <w:t>00 Тәжірибелер</w:t>
             </w:r>
             <w:proofErr w:type="gramEnd"/>
             <w:r>
@@ -1569,7 +1569,7 @@
               <w:rPr>
                 <w:lang w:val="ru-RU"/>
               </w:rPr>
-              <w:t>Зеленая химия</w:t>
+              <w:t>Жасыл химия</w:t>
             </w:r>
             <w:r>
               <w:rPr>
@@ -1611,7 +1611,7 @@
             </w:r>
             <w:proofErr w:type="gramStart"/>
             <w:r>
-              <w:t>зона</w:t>
+              <w:t>аймақ</w:t>
             </w:r>
             <w:r>
               <w:rPr>
@@ -1630,7 +1630,7 @@
               <w:rPr>
                 <w:lang w:val="ru-RU"/>
               </w:rPr>
-              <w:t>площадка</w:t>
+              <w:t>алаң</w:t>
             </w:r>
           </w:p>
         </w:tc>
@@ -1690,7 +1690,7 @@
                 <w:szCs w:val="24"/>
                 <w:lang w:val="ru-RU"/>
               </w:rPr>
-              <w:t xml:space="preserve"> класс по рисованию от </w:t>
+              <w:t xml:space="preserve"> сурет салу сыныбы бастап </w:t>
             </w:r>
             <w:proofErr w:type="spellStart"/>
             <w:r>
@@ -1720,7 +1720,7 @@
                 <w:sz w:val="24"/>
                 <w:szCs w:val="24"/>
               </w:rPr>
-              <w:t>Абжановой</w:t>
+              <w:t>Әбжанова</w:t>
             </w:r>
             <w:proofErr w:type="spellEnd"/>
             <w:r>
@@ -1738,7 +1738,7 @@
                 <w:sz w:val="24"/>
                 <w:szCs w:val="24"/>
               </w:rPr>
-              <w:t>с 12:00 до 14:00</w:t>
+              <w:t>12:00-ден 14:00-ге дейін</w:t>
             </w:r>
             <w:r>
               <w:rPr>
@@ -1784,7 +1784,7 @@
                 <w:sz w:val="24"/>
                 <w:szCs w:val="24"/>
               </w:rPr>
-              <w:t xml:space="preserve"> класс</w:t>
+              <w:t xml:space="preserve"> сыныбы</w:t>
             </w:r>
             <w:r>
               <w:rPr>
@@ -1793,7 +1793,7 @@
                 <w:szCs w:val="24"/>
                 <w:lang w:val="ru-RU"/>
               </w:rPr>
-              <w:t xml:space="preserve"> по рисованию</w:t>
+              <w:t xml:space="preserve"> сурет салу бойынша</w:t>
             </w:r>
             <w:r>
               <w:rPr>
@@ -1810,7 +1810,7 @@
                 <w:sz w:val="24"/>
                 <w:szCs w:val="24"/>
               </w:rPr>
-              <w:t>яблон</w:t>
+              <w:t>алма ағашы</w:t>
             </w:r>
             <w:proofErr w:type="spellEnd"/>
             <w:r>
@@ -1820,7 +1820,7 @@
                 <w:szCs w:val="24"/>
                 <w:lang w:val="ru-RU"/>
               </w:rPr>
-              <w:t>и</w:t>
+              <w:t>және</w:t>
             </w:r>
             <w:r>
               <w:rPr>
@@ -1828,7 +1828,7 @@
                 <w:sz w:val="24"/>
                 <w:szCs w:val="24"/>
               </w:rPr>
-              <w:t xml:space="preserve"> Сиверса</w:t>
+              <w:t xml:space="preserve"> Сиверс</w:t>
             </w:r>
             <w:r>
               <w:rPr>
@@ -1837,7 +1837,7 @@
                 <w:szCs w:val="24"/>
                 <w:lang w:val="ru-RU"/>
               </w:rPr>
-              <w:t xml:space="preserve"> с</w:t>
+              <w:t xml:space="preserve"> бастап</w:t>
             </w:r>
             <w:r>
               <w:rPr>
@@ -1854,7 +1854,7 @@
                 <w:sz w:val="24"/>
                 <w:szCs w:val="24"/>
               </w:rPr>
-              <w:t xml:space="preserve">Бригитте </w:t>
+              <w:t xml:space="preserve">Брижитте </w:t>
             </w:r>
             <w:proofErr w:type="spellStart"/>
             <w:r>
@@ -1882,7 +1882,7 @@
                 <w:szCs w:val="24"/>
                 <w:lang w:val="ru-RU"/>
               </w:rPr>
-              <w:t xml:space="preserve">от </w:t>
+              <w:t xml:space="preserve">бастап </w:t>
             </w:r>
             <w:r>
               <w:rPr>
@@ -1892,7 +1892,7 @@
                 <w:szCs w:val="24"/>
                 <w:lang w:val="ru-RU"/>
               </w:rPr>
-              <w:t>ОФ «</w:t>
+              <w:t>ҚФ "</w:t>
             </w:r>
             <w:proofErr w:type="spellStart"/>
             <w:r>
@@ -1925,7 +1925,7 @@
                 <w:szCs w:val="24"/>
                 <w:lang w:val="ru-RU"/>
               </w:rPr>
-              <w:t>Жумак</w:t>
+              <w:t>Жұмақ</w:t>
             </w:r>
             <w:proofErr w:type="spellEnd"/>
             <w:r>
@@ -1954,7 +1954,7 @@
                 <w:szCs w:val="24"/>
                 <w:lang w:val="ru-RU"/>
               </w:rPr>
-              <w:t>с</w:t>
+              <w:t>бастап</w:t>
             </w:r>
             <w:r>
               <w:rPr>
@@ -1962,7 +1962,7 @@
                 <w:sz w:val="24"/>
                 <w:szCs w:val="24"/>
               </w:rPr>
-              <w:t xml:space="preserve"> 14:00 до 16:00</w:t>
+              <w:t xml:space="preserve"> 14:00-ден 16:00-ге дейін</w:t>
             </w:r>
           </w:p>
           <w:p>
@@ -1991,7 +1991,7 @@
                 <w:szCs w:val="24"/>
                 <w:lang w:val="ru-RU"/>
               </w:rPr>
-              <w:t xml:space="preserve">Мастер-классы по рисованию от </w:t>
+              <w:t xml:space="preserve">Сурет салу бойынша шеберлік сыныптары </w:t>
             </w:r>
             <w:r>
               <w:rPr>
@@ -2000,7 +2000,7 @@
                 <w:sz w:val="24"/>
                 <w:szCs w:val="24"/>
               </w:rPr>
-              <w:t>Центр</w:t>
+              <w:t>Орталық</w:t>
             </w:r>
             <w:r>
               <w:rPr>
@@ -2019,7 +2019,7 @@
                 <w:sz w:val="24"/>
                 <w:szCs w:val="24"/>
               </w:rPr>
-              <w:t xml:space="preserve"> социальной поддержки людей с инвалидностью «</w:t>
+              <w:t xml:space="preserve"> мүгедектігі бар адамдарды әлеуметтік қолдау"</w:t>
             </w:r>
             <w:proofErr w:type="spellStart"/>
             <w:r>
@@ -2084,7 +2084,7 @@
                 <w:szCs w:val="24"/>
                 <w:lang w:val="ru-RU"/>
               </w:rPr>
-              <w:t xml:space="preserve">Создаем открытки с элементами валяния от </w:t>
+              <w:t xml:space="preserve">Киіз басу элементтері бар ашық хаттар жасаймыз </w:t>
             </w:r>
             <w:proofErr w:type="spellStart"/>
             <w:r>
@@ -2116,7 +2116,7 @@
                 <w:szCs w:val="24"/>
                 <w:lang w:val="ru-RU"/>
               </w:rPr>
-              <w:t>Беккуловой</w:t>
+              <w:t>Бекқұлованың</w:t>
             </w:r>
             <w:proofErr w:type="spellEnd"/>
           </w:p>
@@ -2152,7 +2152,7 @@
               <w:rPr>
                 <w:lang w:val="ru-RU"/>
               </w:rPr>
-              <w:t xml:space="preserve">7 Зона: Сад на подоконнике  </w:t>
+              <w:t xml:space="preserve">7 Аймақ: Терезе алдындағы бақ  </w:t>
             </w:r>
           </w:p>
         </w:tc>
@@ -2173,13 +2173,13 @@
               <w:spacing w:line="240" w:lineRule="auto"/>
             </w:pPr>
             <w:r>
-              <w:t>мастер-класс по посадке</w:t>
-            </w:r>
-            <w:r>
-              <w:rPr>
-                <w:lang w:val="ru-RU"/>
-              </w:rPr>
-              <w:t xml:space="preserve"> горшечных растений от лаборатории тропических и субтропических растений Института Ботаники и Фитоинтродукции </w:t>
+              <w:t>қону бойынша мастер-класс</w:t>
+            </w:r>
+            <w:r>
+              <w:rPr>
+                <w:lang w:val="ru-RU"/>
+              </w:rPr>
+              <w:t xml:space="preserve"> Ботаника және фитоинтродукция институтының тропиктік және субтропиктік өсімдіктер зертханасының өсіретін өсімдіктері </w:t>
             </w:r>
           </w:p>
         </w:tc>
@@ -2211,7 +2211,7 @@
               </w:rPr>
             </w:pPr>
             <w:r>
-              <w:t>Выставка картин</w:t>
+              <w:t>Суреттер көрмесі</w:t>
             </w:r>
             <w:r>
               <w:rPr>
@@ -2223,7 +2223,7 @@
               <w:rPr>
                 <w:lang w:val="ru-RU"/>
               </w:rPr>
-              <w:t>(на перголах)</w:t>
+              <w:t>(перголаларда)</w:t>
             </w:r>
           </w:p>
         </w:tc>
@@ -2250,10 +2250,10 @@
               <w:rPr>
                 <w:lang w:val="ru-RU"/>
               </w:rPr>
-              <w:t xml:space="preserve">Выставка картин от </w:t>
-            </w:r>
-            <w:r>
-              <w:t xml:space="preserve">Центра социальной поддержки людей с инвалидностью </w:t>
+              <w:t xml:space="preserve">Суреттер көрмесі </w:t>
+            </w:r>
+            <w:r>
+              <w:t xml:space="preserve">Мүгедектігі бар адамдарды әлеуметтік қолдау орталығының </w:t>
             </w:r>
             <w:r>
               <w:rPr>
@@ -2318,7 +2318,7 @@
                 <w:b/>
                 <w:lang w:val="ru-RU"/>
               </w:rPr>
-              <w:t>Абжановой</w:t>
+              <w:t>Әбжанова</w:t>
             </w:r>
             <w:proofErr w:type="spellEnd"/>
             <w:r>
@@ -2340,7 +2340,7 @@
                 <w:b/>
                 <w:lang w:val="ru-RU"/>
               </w:rPr>
-              <w:t>утизм центров и Ресурсного центра "</w:t>
+              <w:t>орталықтардың және Ресурстық орталықтың утизмі "</w:t>
             </w:r>
             <w:proofErr w:type="spellStart"/>
             <w:r>
@@ -2379,15 +2379,15 @@
                 <w:b/>
                 <w:lang w:val="ru-RU"/>
               </w:rPr>
-              <w:t xml:space="preserve">Фонда Булата </w:t>
-            </w:r>
-            <w:proofErr w:type="spellStart"/>
-            <w:r>
-              <w:rPr>
-                <w:b/>
-                <w:lang w:val="ru-RU"/>
-              </w:rPr>
-              <w:t>Утемуратова</w:t>
+              <w:t xml:space="preserve">Болат қорының </w:t>
+            </w:r>
+            <w:proofErr w:type="spellStart"/>
+            <w:r>
+              <w:rPr>
+                <w:b/>
+                <w:lang w:val="ru-RU"/>
+              </w:rPr>
+              <w:t>Өтемұратов</w:t>
             </w:r>
             <w:proofErr w:type="spellEnd"/>
             <w:r>
@@ -2427,13 +2427,13 @@
             </w:pPr>
             <w:r>
               <w:lastRenderedPageBreak/>
-              <w:t>Выставка детских поделок</w:t>
-            </w:r>
-            <w:r>
-              <w:rPr>
-                <w:lang w:val="ru-RU"/>
-              </w:rPr>
-              <w:t xml:space="preserve"> (на перголах)</w:t>
+              <w:t>Балалар қолөнерінің көрмесі</w:t>
+            </w:r>
+            <w:r>
+              <w:rPr>
+                <w:lang w:val="ru-RU"/>
+              </w:rPr>
+              <w:t xml:space="preserve"> (перголаларда)</w:t>
             </w:r>
           </w:p>
         </w:tc>
@@ -2456,16 +2456,16 @@
               </w:rPr>
             </w:pPr>
             <w:r>
-              <w:t>Детские</w:t>
-            </w:r>
-            <w:r>
-              <w:t xml:space="preserve"> поделки из природных материалов</w:t>
-            </w:r>
-            <w:r>
-              <w:rPr>
-                <w:lang w:val="ru-RU"/>
-              </w:rPr>
-              <w:t xml:space="preserve"> от посетителей ботсада</w:t>
+              <w:t>Балалар</w:t>
+            </w:r>
+            <w:r>
+              <w:t xml:space="preserve"> табиғи материалдардан жасалған қолөнер бұйымдары</w:t>
+            </w:r>
+            <w:r>
+              <w:rPr>
+                <w:lang w:val="ru-RU"/>
+              </w:rPr>
+              <w:t xml:space="preserve"> ботаникалық баққа келушілерден</w:t>
             </w:r>
           </w:p>
         </w:tc>
@@ -2496,14 +2496,14 @@
               </w:rPr>
             </w:pPr>
             <w:r>
-              <w:t xml:space="preserve">Зона </w:t>
-            </w:r>
-            <w:proofErr w:type="spellStart"/>
-            <w:r>
-              <w:rPr>
-                <w:lang w:val="ru-RU"/>
-              </w:rPr>
-              <w:t>Фэшн</w:t>
+              <w:t xml:space="preserve">Аймақ </w:t>
+            </w:r>
+            <w:proofErr w:type="spellStart"/>
+            <w:r>
+              <w:rPr>
+                <w:lang w:val="ru-RU"/>
+              </w:rPr>
+              <w:t>Сән</w:t>
             </w:r>
             <w:proofErr w:type="spellEnd"/>
             <w:r>
@@ -2531,19 +2531,19 @@
               <w:spacing w:line="240" w:lineRule="auto"/>
             </w:pPr>
             <w:r>
-              <w:t>С 15:00 до 16:00</w:t>
-            </w:r>
-            <w:r>
-              <w:rPr>
-                <w:lang w:val="ru-RU"/>
-              </w:rPr>
-              <w:t xml:space="preserve"> инклюзивный показ мод</w:t>
-            </w:r>
-            <w:r>
-              <w:rPr>
-                <w:lang w:val="ru-RU"/>
-              </w:rPr>
-              <w:t xml:space="preserve"> в </w:t>
+              <w:t>15:00-ден 16:00-ге дейін</w:t>
+            </w:r>
+            <w:r>
+              <w:rPr>
+                <w:lang w:val="ru-RU"/>
+              </w:rPr>
+              <w:t xml:space="preserve"> инклюзивті сән көрсетілімі</w:t>
+            </w:r>
+            <w:r>
+              <w:rPr>
+                <w:lang w:val="ru-RU"/>
+              </w:rPr>
+              <w:t xml:space="preserve"> жылы </w:t>
             </w:r>
             <w:r>
               <w:rPr>
@@ -2555,7 +2555,7 @@
               <w:rPr>
                 <w:lang w:val="ru-RU"/>
               </w:rPr>
-              <w:t>стиле от д</w:t>
+              <w:t>стильде д</w:t>
             </w:r>
             <w:r>
               <w:rPr>
@@ -2574,14 +2574,14 @@
               <w:rPr>
                 <w:lang w:val="ru-RU"/>
               </w:rPr>
-              <w:t>апсйклера</w:t>
-            </w:r>
-            <w:proofErr w:type="spellEnd"/>
-            <w:r>
-              <w:rPr>
-                <w:lang w:val="ru-RU"/>
-              </w:rPr>
-              <w:t xml:space="preserve"> и </w:t>
+              <w:t>апсиклера</w:t>
+            </w:r>
+            <w:proofErr w:type="spellEnd"/>
+            <w:r>
+              <w:rPr>
+                <w:lang w:val="ru-RU"/>
+              </w:rPr>
+              <w:t xml:space="preserve"> және </w:t>
             </w:r>
             <w:proofErr w:type="spellStart"/>
             <w:r>
@@ -2603,23 +2603,23 @@
                 <w:b/>
                 <w:lang w:val="ru-RU"/>
               </w:rPr>
-              <w:t>Ботакоз</w:t>
-            </w:r>
-            <w:proofErr w:type="spellEnd"/>
-            <w:r>
-              <w:rPr>
-                <w:b/>
-                <w:lang w:val="ru-RU"/>
-              </w:rPr>
-              <w:t xml:space="preserve"> </w:t>
-            </w:r>
-            <w:proofErr w:type="spellStart"/>
-            <w:r>
-              <w:rPr>
-                <w:b/>
-                <w:lang w:val="ru-RU"/>
-              </w:rPr>
-              <w:t>Садыбековой</w:t>
+              <w:t>Ботакөз</w:t>
+            </w:r>
+            <w:proofErr w:type="spellEnd"/>
+            <w:r>
+              <w:rPr>
+                <w:b/>
+                <w:lang w:val="ru-RU"/>
+              </w:rPr>
+              <w:t xml:space="preserve"> </w:t>
+            </w:r>
+            <w:proofErr w:type="spellStart"/>
+            <w:r>
+              <w:rPr>
+                <w:b/>
+                <w:lang w:val="ru-RU"/>
+              </w:rPr>
+              <w:t>Садыбекованың</w:t>
             </w:r>
             <w:proofErr w:type="spellEnd"/>
           </w:p>
@@ -2660,7 +2660,7 @@
               <w:t>тур</w:t>
             </w:r>
             <w:r>
-              <w:t xml:space="preserve"> "Тайны хранителей Сада"</w:t>
+              <w:t xml:space="preserve"> "Бақ сақшыларының құпиялары"</w:t>
             </w:r>
           </w:p>
         </w:tc>
@@ -2684,7 +2684,7 @@
               <w:rPr>
                 <w:lang w:val="ru-RU"/>
               </w:rPr>
-              <w:t xml:space="preserve">Сказочное аудио-путешествие по ботаническому саду Алматы для детей от </w:t>
+              <w:t xml:space="preserve">Алматының ботаникалық бағы бойынша балаларға арналған ертегідегі аудио-саяхат </w:t>
             </w:r>
             <w:r>
               <w:rPr>
@@ -2696,27 +2696,27 @@
               <w:rPr>
                 <w:lang w:val="ru-RU"/>
               </w:rPr>
-              <w:t xml:space="preserve">+. Для прохождения </w:t>
-            </w:r>
-            <w:proofErr w:type="spellStart"/>
-            <w:r>
-              <w:rPr>
-                <w:lang w:val="ru-RU"/>
-              </w:rPr>
-              <w:t>аудиотура</w:t>
-            </w:r>
-            <w:proofErr w:type="spellEnd"/>
-            <w:r>
-              <w:rPr>
-                <w:lang w:val="ru-RU"/>
-              </w:rPr>
-              <w:t xml:space="preserve"> нужен смартфон и наушники. </w:t>
-            </w:r>
-            <w:r>
-              <w:rPr>
-                <w:lang w:val="ru-RU"/>
-              </w:rPr>
-              <w:t xml:space="preserve">Аудиотур был создан при поддержке компании «Шеврон» </w:t>
+              <w:t xml:space="preserve">+. Өту үшін </w:t>
+            </w:r>
+            <w:proofErr w:type="spellStart"/>
+            <w:r>
+              <w:rPr>
+                <w:lang w:val="ru-RU"/>
+              </w:rPr>
+              <w:t>аудиотур</w:t>
+            </w:r>
+            <w:proofErr w:type="spellEnd"/>
+            <w:r>
+              <w:rPr>
+                <w:lang w:val="ru-RU"/>
+              </w:rPr>
+              <w:t xml:space="preserve"> смартфон мен құлаққап қажет. </w:t>
+            </w:r>
+            <w:r>
+              <w:rPr>
+                <w:lang w:val="ru-RU"/>
+              </w:rPr>
+              <w:t xml:space="preserve">Аудиотур "Шеврон" компаниясының қолдауымен құрылды. </w:t>
             </w:r>
           </w:p>
         </w:tc>
@@ -2747,7 +2747,7 @@
               </w:rPr>
             </w:pPr>
             <w:r>
-              <w:t>Входной павильон - Проведение экскурсий по ботаническому саду</w:t>
+              <w:t>Кіру павильоны - Ботаникалық баққа экскурсиялар жүргізу</w:t>
             </w:r>
           </w:p>
         </w:tc>
@@ -2774,31 +2774,31 @@
               <w:rPr>
                 <w:lang w:val="ru-RU"/>
               </w:rPr>
-              <w:t xml:space="preserve">Экскурсии с гидами – научными сотрудниками Института Ботаники и Фитоинтродукции по коллекциям </w:t>
-            </w:r>
-            <w:r>
-              <w:rPr>
-                <w:lang w:val="ru-RU"/>
-              </w:rPr>
-              <w:t>Главн</w:t>
-            </w:r>
-            <w:r>
-              <w:rPr>
-                <w:lang w:val="ru-RU"/>
-              </w:rPr>
-              <w:t xml:space="preserve">ого </w:t>
-            </w:r>
-            <w:r>
-              <w:t>Ботаническ</w:t>
-            </w:r>
-            <w:r>
-              <w:rPr>
-                <w:lang w:val="ru-RU"/>
-              </w:rPr>
-              <w:t>ого</w:t>
-            </w:r>
-            <w:r>
-              <w:t xml:space="preserve"> Сад</w:t>
+              <w:t xml:space="preserve">Ботаника және фитоинтродукция институтының жетекші –ғылыми қызметкерлерімен коллекциялар бойынша экскурсиялар </w:t>
+            </w:r>
+            <w:r>
+              <w:rPr>
+                <w:lang w:val="ru-RU"/>
+              </w:rPr>
+              <w:t>Басты бет</w:t>
+            </w:r>
+            <w:r>
+              <w:rPr>
+                <w:lang w:val="ru-RU"/>
+              </w:rPr>
+              <w:t xml:space="preserve">ақұ </w:t>
+            </w:r>
+            <w:r>
+              <w:t>Ботаникалық</w:t>
+            </w:r>
+            <w:r>
+              <w:rPr>
+                <w:lang w:val="ru-RU"/>
+              </w:rPr>
+              <w:t>ақұ</w:t>
+            </w:r>
+            <w:r>
+              <w:t xml:space="preserve"> Бақша</w:t>
             </w:r>
             <w:r>
               <w:rPr>
@@ -2813,7 +2813,7 @@
               <w:rPr>
                 <w:lang w:val="ru-RU"/>
               </w:rPr>
-              <w:t>. Группы на русском и казахском языках.</w:t>
+              <w:t>. Топтар қазақ және орыс тілдерінде.</w:t>
             </w:r>
           </w:p>
         </w:tc>
@@ -2847,7 +2847,7 @@
               <w:rPr>
                 <w:lang w:val="ru-RU"/>
               </w:rPr>
-              <w:t>Субботник</w:t>
+              <w:t>Сенбілік</w:t>
             </w:r>
             <w:r>
               <w:rPr>
@@ -2886,7 +2886,7 @@
               <w:rPr>
                 <w:lang w:val="ru-RU"/>
               </w:rPr>
-              <w:t>Акция по уборке территории после фестиваля от в</w:t>
+              <w:t>Фестивальдан кейін аумақты тазалау бойынша акция в</w:t>
             </w:r>
             <w:r>
               <w:rPr>
@@ -2911,7 +2911,7 @@
                 <w:b/>
                 <w:lang w:val="ru-RU"/>
               </w:rPr>
-              <w:t>Федерации клубов ЮНЕСКО</w:t>
+              <w:t>ЮНЕСКО клубтарының федерациялары</w:t>
             </w:r>
           </w:p>
         </w:tc>
@@ -2986,7 +2986,7 @@
                 <w:sz w:val="26"/>
                 <w:szCs w:val="26"/>
               </w:rPr>
-              <w:t>Программа сцены</w:t>
+              <w:t>Сахна бағдарламасы</w:t>
             </w:r>
           </w:p>
         </w:tc>
@@ -3021,20 +3021,20 @@
               <w:rPr>
                 <w:lang w:val="ru-RU"/>
               </w:rPr>
-              <w:t>Викторина по технике безопасности проекта SAQ 2025</w:t>
-            </w:r>
-            <w:r>
-              <w:rPr>
-                <w:lang w:val="ru-RU"/>
-              </w:rPr>
-              <w:t xml:space="preserve"> от </w:t>
-            </w:r>
-            <w:r>
-              <w:rPr>
-                <w:b/>
-                <w:lang w:val="ru-RU"/>
-              </w:rPr>
-              <w:t>Национальной Волонтерской сети</w:t>
+              <w:t>SAQ 2025 жобасының қауіпсіздік викторинасы</w:t>
+            </w:r>
+            <w:r>
+              <w:rPr>
+                <w:lang w:val="ru-RU"/>
+              </w:rPr>
+              <w:t xml:space="preserve"> бастап </w:t>
+            </w:r>
+            <w:r>
+              <w:rPr>
+                <w:b/>
+                <w:lang w:val="ru-RU"/>
+              </w:rPr>
+              <w:t>Ұлттық волонтерлік желінің</w:t>
             </w:r>
           </w:p>
         </w:tc>
@@ -3096,7 +3096,7 @@
               </w:rPr>
             </w:pPr>
             <w:r>
-              <w:t xml:space="preserve">Шоу-выступление флориста </w:t>
+              <w:t xml:space="preserve">Флористің шоу-қойылымы </w:t>
             </w:r>
             <w:r>
               <w:rPr>
@@ -3130,7 +3130,7 @@
                 <w:b/>
                 <w:lang w:val="kk-KZ"/>
               </w:rPr>
-              <w:t>я</w:t>
+              <w:t>мен</w:t>
             </w:r>
           </w:p>
         </w:tc>
@@ -3191,16 +3191,16 @@
               </w:rPr>
             </w:pPr>
             <w:r>
-              <w:t xml:space="preserve">Приветственное слово от </w:t>
-            </w:r>
-            <w:r>
-              <w:t xml:space="preserve">представителя Евразийского подразделения компании </w:t>
-            </w:r>
-            <w:r>
-              <w:rPr>
-                <w:b/>
-              </w:rPr>
-              <w:t>«Шеврон»</w:t>
+              <w:t xml:space="preserve">Құттықтау сөз </w:t>
+            </w:r>
+            <w:r>
+              <w:t xml:space="preserve">компанияның Еуразиялық бөлімшесінің өкілі </w:t>
+            </w:r>
+            <w:r>
+              <w:rPr>
+                <w:b/>
+              </w:rPr>
+              <w:t>"Шеврон"</w:t>
             </w:r>
           </w:p>
         </w:tc>
@@ -3261,20 +3261,20 @@
               </w:rPr>
             </w:pPr>
             <w:r>
-              <w:t>Приветственное слово от</w:t>
-            </w:r>
-            <w:r>
-              <w:rPr>
-                <w:lang w:val="ru-RU"/>
-              </w:rPr>
-              <w:t xml:space="preserve"> </w:t>
-            </w:r>
-            <w:r>
-              <w:rPr>
-                <w:b/>
-                <w:lang w:val="ru-RU"/>
-              </w:rPr>
-              <w:t>ОФ</w:t>
+              <w:t>Құттықтау сөз</w:t>
+            </w:r>
+            <w:r>
+              <w:rPr>
+                <w:lang w:val="ru-RU"/>
+              </w:rPr>
+              <w:t xml:space="preserve"> </w:t>
+            </w:r>
+            <w:r>
+              <w:rPr>
+                <w:b/>
+                <w:lang w:val="ru-RU"/>
+              </w:rPr>
+              <w:t>БФ</w:t>
             </w:r>
             <w:r>
               <w:rPr>
@@ -3350,23 +3350,23 @@
               </w:rPr>
             </w:pPr>
             <w:r>
-              <w:t xml:space="preserve">Приветственно слово от </w:t>
-            </w:r>
-            <w:r>
-              <w:rPr>
-                <w:b/>
-                <w:lang w:val="ru-RU"/>
-              </w:rPr>
-              <w:t>Института Ботаники и Фитоинтродукции</w:t>
-            </w:r>
-            <w:r>
-              <w:t xml:space="preserve"> и презентация образовательных программ</w:t>
-            </w:r>
-            <w:r>
-              <w:rPr>
-                <w:lang w:val="ru-RU"/>
-              </w:rPr>
-              <w:t xml:space="preserve"> в ботсаду</w:t>
+              <w:t xml:space="preserve">Құттықтау сөз бастап </w:t>
+            </w:r>
+            <w:r>
+              <w:rPr>
+                <w:b/>
+                <w:lang w:val="ru-RU"/>
+              </w:rPr>
+              <w:t>Ботаника және фитоинтродукция институтының</w:t>
+            </w:r>
+            <w:r>
+              <w:t xml:space="preserve"> және білім беру бағдарламаларының презентациясы</w:t>
+            </w:r>
+            <w:r>
+              <w:rPr>
+                <w:lang w:val="ru-RU"/>
+              </w:rPr>
+              <w:t xml:space="preserve"> ботаникалық бақта</w:t>
             </w:r>
             <w:r>
               <w:rPr>
@@ -3433,19 +3433,19 @@
               </w:rPr>
             </w:pPr>
             <w:r>
-              <w:t xml:space="preserve">Сакральные деревья. О живой памяти, корнях и будущем - </w:t>
-            </w:r>
-            <w:proofErr w:type="spellStart"/>
-            <w:r>
-              <w:t>Темиртас</w:t>
-            </w:r>
-            <w:proofErr w:type="spellEnd"/>
-            <w:r>
-              <w:t xml:space="preserve"> </w:t>
-            </w:r>
-            <w:proofErr w:type="spellStart"/>
-            <w:r>
-              <w:t>Искаков</w:t>
+              <w:t xml:space="preserve">Киелі ағаштар. Тірі жад, тамырлар және болашақ туралы - </w:t>
+            </w:r>
+            <w:proofErr w:type="spellStart"/>
+            <w:r>
+              <w:t>Теміртас</w:t>
+            </w:r>
+            <w:proofErr w:type="spellEnd"/>
+            <w:r>
+              <w:t xml:space="preserve"> </w:t>
+            </w:r>
+            <w:proofErr w:type="spellStart"/>
+            <w:r>
+              <w:t>Ысқақов</w:t>
             </w:r>
             <w:proofErr w:type="spellEnd"/>
             <w:r>
@@ -3532,7 +3532,7 @@
               </w:rPr>
             </w:pPr>
             <w:r>
-              <w:t xml:space="preserve">Доступный туризм, </w:t>
+              <w:t xml:space="preserve">Қолжетімді туризм, </w:t>
             </w:r>
             <w:proofErr w:type="spellStart"/>
             <w:r>
@@ -3547,7 +3547,7 @@
               <w:rPr>
                 <w:b/>
               </w:rPr>
-              <w:t>Джепка</w:t>
+              <w:t>Қалпақ</w:t>
             </w:r>
             <w:proofErr w:type="spellEnd"/>
             <w:r>
@@ -3615,7 +3615,7 @@
               </w:rPr>
             </w:pPr>
             <w:r>
-              <w:t xml:space="preserve">«Загрязнение окружающей среды и </w:t>
+              <w:t xml:space="preserve">"Қоршаған ортаның ластануы және </w:t>
             </w:r>
             <w:r>
               <w:rPr>
@@ -3625,11 +3625,11 @@
             </w:r>
             <w:proofErr w:type="spellStart"/>
             <w:r>
-              <w:t>аздельный</w:t>
-            </w:r>
-            <w:proofErr w:type="spellEnd"/>
-            <w:r>
-              <w:t xml:space="preserve"> сбор отходов</w:t>
+              <w:t>азделді</w:t>
+            </w:r>
+            <w:proofErr w:type="spellEnd"/>
+            <w:r>
+              <w:t xml:space="preserve"> қалдықтарды жинау</w:t>
             </w:r>
             <w:r>
               <w:rPr>
@@ -3644,7 +3644,7 @@
               <w:rPr>
                 <w:b/>
               </w:rPr>
-              <w:t>Общественный фонд Greenup.kz</w:t>
+              <w:t>Қоғамдық қор Greenup.kz</w:t>
             </w:r>
             <w:r>
               <w:t xml:space="preserve"> (</w:t>
@@ -3717,22 +3717,22 @@
               </w:rPr>
             </w:pPr>
             <w:r>
-              <w:t>И</w:t>
-            </w:r>
-            <w:r>
-              <w:t xml:space="preserve">нклюзия в действии: как технологии меняют мир - Дмитрий Пак и </w:t>
-            </w:r>
-            <w:proofErr w:type="spellStart"/>
-            <w:r>
-              <w:t>Бекгожаев</w:t>
-            </w:r>
-            <w:proofErr w:type="spellEnd"/>
-            <w:r>
-              <w:t xml:space="preserve"> </w:t>
-            </w:r>
-            <w:proofErr w:type="spellStart"/>
-            <w:r>
-              <w:t>Даурен</w:t>
+              <w:t>Және</w:t>
+            </w:r>
+            <w:r>
+              <w:t xml:space="preserve">әрекеттегі инклюзия: технология әлемді қалай өзгертеді - Дмитрий Пак және </w:t>
+            </w:r>
+            <w:proofErr w:type="spellStart"/>
+            <w:r>
+              <w:t>Бекғожаев</w:t>
+            </w:r>
+            <w:proofErr w:type="spellEnd"/>
+            <w:r>
+              <w:t xml:space="preserve"> </w:t>
+            </w:r>
+            <w:proofErr w:type="spellStart"/>
+            <w:r>
+              <w:t>Дәурен</w:t>
             </w:r>
             <w:proofErr w:type="spellEnd"/>
             <w:r>
@@ -3809,13 +3809,13 @@
               </w:rPr>
             </w:pPr>
             <w:r>
-              <w:t xml:space="preserve">Лекция "Красная Книга - сигнал бедствия из мира растений", </w:t>
-            </w:r>
-            <w:r>
-              <w:rPr>
-                <w:lang w:val="ru-RU"/>
-              </w:rPr>
-              <w:t xml:space="preserve">Гульнара </w:t>
+              <w:t xml:space="preserve">"Қызыл кітап - өсімдіктер әлемінен келетін апат сигналы" дәрісі, </w:t>
+            </w:r>
+            <w:r>
+              <w:rPr>
+                <w:lang w:val="ru-RU"/>
+              </w:rPr>
+              <w:t xml:space="preserve">Гүлнара </w:t>
             </w:r>
             <w:proofErr w:type="gramStart"/>
             <w:r>
@@ -3836,7 +3836,7 @@
               <w:rPr>
                 <w:lang w:val="ru-RU"/>
               </w:rPr>
-              <w:t>еральный</w:t>
+              <w:t>ерен</w:t>
             </w:r>
             <w:proofErr w:type="spellEnd"/>
             <w:r>
@@ -3846,7 +3846,7 @@
               <w:rPr>
                 <w:b/>
               </w:rPr>
-              <w:t>Института Ботаники и Фитоинтродукции</w:t>
+              <w:t>Ботаника және фитоинтродукция институтының</w:t>
             </w:r>
           </w:p>
         </w:tc>
@@ -3907,7 +3907,7 @@
               </w:rPr>
             </w:pPr>
             <w:r>
-              <w:t xml:space="preserve">Инклюзия изнутри: уроки, которые дала мне школа - </w:t>
+              <w:t xml:space="preserve">Іштен инклюзия: мектеп маған берген сабақтар - </w:t>
             </w:r>
             <w:proofErr w:type="spellStart"/>
             <w:r>
@@ -3919,7 +3919,7 @@
             </w:r>
             <w:proofErr w:type="spellStart"/>
             <w:r>
-              <w:t>Жумагалиева</w:t>
+              <w:t>Жұмағалиева</w:t>
             </w:r>
             <w:proofErr w:type="spellEnd"/>
             <w:r>
@@ -3929,7 +3929,7 @@
               <w:rPr>
                 <w:lang w:val="ru-RU"/>
               </w:rPr>
-              <w:t xml:space="preserve">фонд </w:t>
+              <w:t xml:space="preserve">қор </w:t>
             </w:r>
             <w:proofErr w:type="spellStart"/>
             <w:r>
@@ -3998,7 +3998,7 @@
               </w:rPr>
             </w:pPr>
             <w:r>
-              <w:t xml:space="preserve">Перформативная лекция «Когда ботаники спасли этот мир» от театра </w:t>
+              <w:t xml:space="preserve">Театрдан "Нердтер бұл дүниені құтқарған кезде" атты орындаушылық дәріс </w:t>
             </w:r>
             <w:proofErr w:type="spellStart"/>
             <w:r>
@@ -4068,20 +4068,20 @@
               </w:rPr>
             </w:pPr>
             <w:r>
-              <w:t>Документальный фильм «Алматы? Ок жить со смогом?»</w:t>
-            </w:r>
-            <w:r>
-              <w:rPr>
-                <w:lang w:val="ru-RU"/>
-              </w:rPr>
-              <w:t xml:space="preserve"> режиссера </w:t>
-            </w:r>
-            <w:r>
-              <w:rPr>
-                <w:b/>
-                <w:lang w:val="ru-RU"/>
-              </w:rPr>
-              <w:t>Канат</w:t>
+              <w:t>Деректі фильм "Алматы? Түтінмен өмір сүруге бола ма?"</w:t>
+            </w:r>
+            <w:r>
+              <w:rPr>
+                <w:lang w:val="ru-RU"/>
+              </w:rPr>
+              <w:t xml:space="preserve"> режиссердің </w:t>
+            </w:r>
+            <w:r>
+              <w:rPr>
+                <w:b/>
+                <w:lang w:val="ru-RU"/>
+              </w:rPr>
+              <w:t>Арқан</w:t>
             </w:r>
             <w:r>
               <w:rPr>
@@ -4130,7 +4130,7 @@
               <w:rPr>
                 <w:lang w:val="kk-KZ"/>
               </w:rPr>
-              <w:t xml:space="preserve">и </w:t>
+              <w:t xml:space="preserve">және </w:t>
             </w:r>
             <w:r>
               <w:rPr>

</xml_diff>